<commit_message>
nmv 02 09 2026
</commit_message>
<xml_diff>
--- a/TS Jatai Ghanam Project/TS 3.2/TS 3.2 Ghanam Malayalam Corrections.docx
+++ b/TS Jatai Ghanam Project/TS 3.2/TS 3.2 Ghanam Malayalam Corrections.docx
@@ -1,7 +1,391 @@
 
 <file path=word/document.xml><?xml version="1.0" encoding="utf-8"?>
-<w:document xmlns:wpc="http://schemas.microsoft.com/office/word/2010/wordprocessingCanvas" xmlns:cx="http://schemas.microsoft.com/office/drawing/2014/chartex" xmlns:cx1="http://schemas.microsoft.com/office/drawing/2015/9/8/chartex" xmlns:cx2="http://schemas.microsoft.com/office/drawing/2015/10/21/chartex" xmlns:cx3="http://schemas.microsoft.com/office/drawing/2016/5/9/chartex" xmlns:cx4="http://schemas.microsoft.com/office/drawing/2016/5/10/chartex" xmlns:cx5="http://schemas.microsoft.com/office/drawing/2016/5/11/chartex" xmlns:cx6="http://schemas.microsoft.com/office/drawing/2016/5/12/chartex" xmlns:cx7="http://schemas.microsoft.com/office/drawing/2016/5/13/chartex" xmlns:cx8="http://schemas.microsoft.com/office/drawing/2016/5/14/chartex" xmlns:mc="http://schemas.openxmlformats.org/markup-compatibility/2006" xmlns:aink="http://schemas.microsoft.com/office/drawing/2016/ink" xmlns:am3d="http://schemas.microsoft.com/office/drawing/2017/model3d" xmlns:o="urn:schemas-microsoft-com:office:office" xmlns:oel="http://schemas.microsoft.com/office/2019/extlst" xmlns:r="http://schemas.openxmlformats.org/officeDocument/2006/relationships" xmlns:m="http://schemas.openxmlformats.org/officeDocument/2006/math" xmlns:v="urn:schemas-microsoft-com:vml" xmlns:wp14="http://schemas.microsoft.com/office/word/2010/wordprocessingDrawing" xmlns:wp="http://schemas.openxmlformats.org/drawingml/2006/wordprocessingDrawing" xmlns:w10="urn:schemas-microsoft-com:office:word" xmlns:w="http://schemas.openxmlformats.org/wordprocessingml/2006/main" xmlns:w14="http://schemas.microsoft.com/office/word/2010/wordml" xmlns:w15="http://schemas.microsoft.com/office/word/2012/wordml" xmlns:w16cex="http://schemas.microsoft.com/office/word/2018/wordml/cex" xmlns:w16cid="http://schemas.microsoft.com/office/word/2016/wordml/cid" xmlns:w16="http://schemas.microsoft.com/office/word/2018/wordml" xmlns:w16sdtdh="http://schemas.microsoft.com/office/word/2020/wordml/sdtdatahash" xmlns:w16se="http://schemas.microsoft.com/office/word/2015/wordml/symex" xmlns:wpg="http://schemas.microsoft.com/office/word/2010/wordprocessingGroup" xmlns:wpi="http://schemas.microsoft.com/office/word/2010/wordprocessingInk" xmlns:wne="http://schemas.microsoft.com/office/word/2006/wordml" xmlns:wps="http://schemas.microsoft.com/office/word/2010/wordprocessingShape" mc:Ignorable="w14 w15 w16se w16cid w16 w16cex w16sdtdh wp14">
+<w:document xmlns:wpc="http://schemas.microsoft.com/office/word/2010/wordprocessingCanvas" xmlns:cx="http://schemas.microsoft.com/office/drawing/2014/chartex" xmlns:cx1="http://schemas.microsoft.com/office/drawing/2015/9/8/chartex" xmlns:cx2="http://schemas.microsoft.com/office/drawing/2015/10/21/chartex" xmlns:cx3="http://schemas.microsoft.com/office/drawing/2016/5/9/chartex" xmlns:cx4="http://schemas.microsoft.com/office/drawing/2016/5/10/chartex" xmlns:cx5="http://schemas.microsoft.com/office/drawing/2016/5/11/chartex" xmlns:cx6="http://schemas.microsoft.com/office/drawing/2016/5/12/chartex" xmlns:cx7="http://schemas.microsoft.com/office/drawing/2016/5/13/chartex" xmlns:cx8="http://schemas.microsoft.com/office/drawing/2016/5/14/chartex" xmlns:mc="http://schemas.openxmlformats.org/markup-compatibility/2006" xmlns:aink="http://schemas.microsoft.com/office/drawing/2016/ink" xmlns:am3d="http://schemas.microsoft.com/office/drawing/2017/model3d" xmlns:o="urn:schemas-microsoft-com:office:office" xmlns:oel="http://schemas.microsoft.com/office/2019/extlst" xmlns:r="http://schemas.openxmlformats.org/officeDocument/2006/relationships" xmlns:m="http://schemas.openxmlformats.org/officeDocument/2006/math" xmlns:v="urn:schemas-microsoft-com:vml" xmlns:wp14="http://schemas.microsoft.com/office/word/2010/wordprocessingDrawing" xmlns:wp="http://schemas.openxmlformats.org/drawingml/2006/wordprocessingDrawing" xmlns:w10="urn:schemas-microsoft-com:office:word" xmlns:w="http://schemas.openxmlformats.org/wordprocessingml/2006/main" xmlns:w14="http://schemas.microsoft.com/office/word/2010/wordml" xmlns:w15="http://schemas.microsoft.com/office/word/2012/wordml" xmlns:w16cex="http://schemas.microsoft.com/office/word/2018/wordml/cex" xmlns:w16cid="http://schemas.microsoft.com/office/word/2016/wordml/cid" xmlns:w16="http://schemas.microsoft.com/office/word/2018/wordml" xmlns:w16du="http://schemas.microsoft.com/office/word/2023/wordml/word16du" xmlns:w16sdtdh="http://schemas.microsoft.com/office/word/2020/wordml/sdtdatahash" xmlns:w16sdtfl="http://schemas.microsoft.com/office/word/2024/wordml/sdtformatlock" xmlns:w16se="http://schemas.microsoft.com/office/word/2015/wordml/symex" xmlns:wpg="http://schemas.microsoft.com/office/word/2010/wordprocessingGroup" xmlns:wpi="http://schemas.microsoft.com/office/word/2010/wordprocessingInk" xmlns:wne="http://schemas.microsoft.com/office/word/2006/wordml" xmlns:wps="http://schemas.microsoft.com/office/word/2010/wordprocessingShape" mc:Ignorable="w14 w15 w16se w16cid w16 w16cex w16sdtdh w16sdtfl w16du wp14">
   <w:body>
+    <w:p>
+      <w:pPr>
+        <w:spacing w:before="0" w:line="240" w:lineRule="auto"/>
+        <w:jc w:val="center"/>
+        <w:rPr>
+          <w:b/>
+          <w:bCs/>
+          <w:sz w:val="32"/>
+          <w:szCs w:val="32"/>
+          <w:u w:val="single"/>
+        </w:rPr>
+      </w:pPr>
+    </w:p>
+    <w:p>
+      <w:pPr>
+        <w:spacing w:before="0" w:line="240" w:lineRule="auto"/>
+        <w:jc w:val="center"/>
+        <w:rPr>
+          <w:b/>
+          <w:bCs/>
+          <w:sz w:val="32"/>
+          <w:szCs w:val="32"/>
+          <w:u w:val="single"/>
+        </w:rPr>
+      </w:pPr>
+      <w:r>
+        <w:rPr>
+          <w:b/>
+          <w:bCs/>
+          <w:sz w:val="32"/>
+          <w:szCs w:val="32"/>
+          <w:u w:val="single"/>
+        </w:rPr>
+        <w:t xml:space="preserve">TS </w:t>
+      </w:r>
+      <w:r>
+        <w:rPr>
+          <w:b/>
+          <w:bCs/>
+          <w:sz w:val="32"/>
+          <w:szCs w:val="32"/>
+          <w:u w:val="single"/>
+        </w:rPr>
+        <w:t>Ghanam</w:t>
+      </w:r>
+      <w:r>
+        <w:rPr>
+          <w:b/>
+          <w:bCs/>
+          <w:sz w:val="32"/>
+          <w:szCs w:val="32"/>
+          <w:u w:val="single"/>
+        </w:rPr>
+        <w:t xml:space="preserve"> </w:t>
+      </w:r>
+      <w:r>
+        <w:rPr>
+          <w:b/>
+          <w:bCs/>
+          <w:sz w:val="32"/>
+          <w:szCs w:val="32"/>
+          <w:u w:val="single"/>
+        </w:rPr>
+        <w:t xml:space="preserve">– TS </w:t>
+      </w:r>
+      <w:r>
+        <w:rPr>
+          <w:b/>
+          <w:bCs/>
+          <w:sz w:val="32"/>
+          <w:szCs w:val="32"/>
+          <w:u w:val="single"/>
+        </w:rPr>
+        <w:t>3.2</w:t>
+      </w:r>
+      <w:r>
+        <w:rPr>
+          <w:b/>
+          <w:bCs/>
+          <w:sz w:val="32"/>
+          <w:szCs w:val="32"/>
+          <w:u w:val="single"/>
+        </w:rPr>
+        <w:t xml:space="preserve"> </w:t>
+      </w:r>
+      <w:r>
+        <w:rPr>
+          <w:b/>
+          <w:bCs/>
+          <w:sz w:val="32"/>
+          <w:szCs w:val="32"/>
+          <w:u w:val="single"/>
+        </w:rPr>
+        <w:t>Malayalam</w:t>
+      </w:r>
+      <w:r>
+        <w:rPr>
+          <w:b/>
+          <w:bCs/>
+          <w:sz w:val="32"/>
+          <w:szCs w:val="32"/>
+          <w:u w:val="single"/>
+        </w:rPr>
+        <w:t xml:space="preserve"> Corrections –</w:t>
+      </w:r>
+      <w:r>
+        <w:rPr>
+          <w:b/>
+          <w:bCs/>
+          <w:sz w:val="32"/>
+          <w:szCs w:val="32"/>
+          <w:u w:val="single"/>
+        </w:rPr>
+        <w:t xml:space="preserve"> </w:t>
+      </w:r>
+      <w:r>
+        <w:rPr>
+          <w:b/>
+          <w:bCs/>
+          <w:sz w:val="32"/>
+          <w:szCs w:val="32"/>
+          <w:u w:val="single"/>
+        </w:rPr>
+        <w:t xml:space="preserve">Observed till </w:t>
+      </w:r>
+      <w:r>
+        <w:rPr>
+          <w:b/>
+          <w:bCs/>
+          <w:sz w:val="32"/>
+          <w:szCs w:val="32"/>
+          <w:u w:val="single"/>
+        </w:rPr>
+        <w:t>3</w:t>
+      </w:r>
+      <w:r>
+        <w:rPr>
+          <w:b/>
+          <w:bCs/>
+          <w:sz w:val="32"/>
+          <w:szCs w:val="32"/>
+          <w:u w:val="single"/>
+        </w:rPr>
+        <w:t>1st</w:t>
+      </w:r>
+      <w:r>
+        <w:rPr>
+          <w:b/>
+          <w:bCs/>
+          <w:sz w:val="32"/>
+          <w:szCs w:val="32"/>
+          <w:u w:val="single"/>
+        </w:rPr>
+        <w:t xml:space="preserve"> </w:t>
+      </w:r>
+      <w:r>
+        <w:rPr>
+          <w:b/>
+          <w:bCs/>
+          <w:sz w:val="32"/>
+          <w:szCs w:val="32"/>
+          <w:u w:val="single"/>
+        </w:rPr>
+        <w:t>Aug</w:t>
+      </w:r>
+      <w:r>
+        <w:rPr>
+          <w:b/>
+          <w:bCs/>
+          <w:sz w:val="32"/>
+          <w:szCs w:val="32"/>
+          <w:u w:val="single"/>
+        </w:rPr>
+        <w:t xml:space="preserve"> 202</w:t>
+      </w:r>
+      <w:r>
+        <w:rPr>
+          <w:b/>
+          <w:bCs/>
+          <w:sz w:val="32"/>
+          <w:szCs w:val="32"/>
+          <w:u w:val="single"/>
+        </w:rPr>
+        <w:t>6</w:t>
+      </w:r>
+    </w:p>
+    <w:p>
+      <w:pPr>
+        <w:spacing w:before="0" w:line="240" w:lineRule="auto"/>
+        <w:jc w:val="center"/>
+        <w:rPr>
+          <w:b/>
+          <w:bCs/>
+          <w:sz w:val="28"/>
+          <w:szCs w:val="32"/>
+        </w:rPr>
+      </w:pPr>
+      <w:r>
+        <w:rPr>
+          <w:b/>
+          <w:bCs/>
+          <w:sz w:val="28"/>
+          <w:szCs w:val="32"/>
+        </w:rPr>
+        <w:t>(ignore those which are already incorporated in your book’s version and date)</w:t>
+      </w:r>
+    </w:p>
+    <w:tbl>
+      <w:tblPr>
+        <w:tblW w:w="14537" w:type="dxa"/>
+        <w:tblInd w:w="-792" w:type="dxa"/>
+        <w:tblBorders>
+          <w:top w:val="single" w:sz="4" w:space="0" w:color="000000"/>
+          <w:left w:val="single" w:sz="4" w:space="0" w:color="000000"/>
+          <w:bottom w:val="single" w:sz="4" w:space="0" w:color="000000"/>
+          <w:right w:val="single" w:sz="4" w:space="0" w:color="000000"/>
+          <w:insideH w:val="single" w:sz="4" w:space="0" w:color="000000"/>
+          <w:insideV w:val="single" w:sz="4" w:space="0" w:color="000000"/>
+        </w:tblBorders>
+        <w:tblLook w:val="04A0" w:firstRow="1" w:lastRow="0" w:firstColumn="1" w:lastColumn="0" w:noHBand="0" w:noVBand="1"/>
+      </w:tblPr>
+      <w:tblGrid>
+        <w:gridCol w:w="7166"/>
+        <w:gridCol w:w="7371"/>
+      </w:tblGrid>
+      <w:tr>
+        <w:tc>
+          <w:tcPr>
+            <w:tcW w:w="7166" w:type="dxa"/>
+          </w:tcPr>
+          <w:p>
+            <w:pPr>
+              <w:spacing w:before="0" w:line="240" w:lineRule="auto"/>
+              <w:jc w:val="center"/>
+              <w:rPr>
+                <w:b/>
+                <w:sz w:val="32"/>
+                <w:szCs w:val="32"/>
+              </w:rPr>
+            </w:pPr>
+            <w:r>
+              <w:rPr>
+                <w:b/>
+                <w:sz w:val="32"/>
+                <w:szCs w:val="32"/>
+              </w:rPr>
+              <w:t>As Printed</w:t>
+            </w:r>
+          </w:p>
+        </w:tc>
+        <w:tc>
+          <w:tcPr>
+            <w:tcW w:w="7371" w:type="dxa"/>
+          </w:tcPr>
+          <w:p>
+            <w:pPr>
+              <w:spacing w:before="0" w:line="240" w:lineRule="auto"/>
+              <w:ind w:right="-18"/>
+              <w:jc w:val="center"/>
+              <w:rPr>
+                <w:b/>
+                <w:sz w:val="32"/>
+                <w:szCs w:val="32"/>
+              </w:rPr>
+            </w:pPr>
+            <w:r>
+              <w:rPr>
+                <w:b/>
+                <w:sz w:val="32"/>
+                <w:szCs w:val="32"/>
+              </w:rPr>
+              <w:t>To be read as or corrected as</w:t>
+            </w:r>
+            <w:r>
+              <w:rPr>
+                <w:b/>
+                <w:sz w:val="32"/>
+                <w:szCs w:val="32"/>
+              </w:rPr>
+              <w:t xml:space="preserve"> </w:t>
+            </w:r>
+          </w:p>
+        </w:tc>
+      </w:tr>
+      <w:tr>
+        <w:trPr>
+          <w:trHeight w:val="630"/>
+        </w:trPr>
+        <w:tc>
+          <w:tcPr>
+            <w:tcW w:w="7166" w:type="dxa"/>
+          </w:tcPr>
+          <w:p>
+            <w:pPr>
+              <w:widowControl w:val="0"/>
+              <w:autoSpaceDE w:val="0"/>
+              <w:autoSpaceDN w:val="0"/>
+              <w:adjustRightInd w:val="0"/>
+              <w:spacing w:before="0" w:line="240" w:lineRule="auto"/>
+              <w:rPr>
+                <w:rFonts w:cs="BRH Malayalam Extra"/>
+                <w:b/>
+                <w:bCs/>
+                <w:szCs w:val="40"/>
+              </w:rPr>
+            </w:pPr>
+            <w:r>
+              <w:rPr>
+                <w:rFonts w:cs="BRH Malayalam Extra"/>
+                <w:b/>
+                <w:bCs/>
+                <w:szCs w:val="40"/>
+              </w:rPr>
+              <w:t>NONE                          NONE                               NONE</w:t>
+            </w:r>
+          </w:p>
+        </w:tc>
+        <w:tc>
+          <w:tcPr>
+            <w:tcW w:w="7371" w:type="dxa"/>
+          </w:tcPr>
+          <w:p>
+            <w:pPr>
+              <w:widowControl w:val="0"/>
+              <w:autoSpaceDE w:val="0"/>
+              <w:autoSpaceDN w:val="0"/>
+              <w:adjustRightInd w:val="0"/>
+              <w:spacing w:before="0" w:line="240" w:lineRule="auto"/>
+              <w:rPr>
+                <w:rFonts w:cs="BRH Malayalam Extra"/>
+                <w:b/>
+                <w:bCs/>
+                <w:szCs w:val="40"/>
+              </w:rPr>
+            </w:pPr>
+            <w:r>
+              <w:rPr>
+                <w:rFonts w:cs="BRH Malayalam Extra"/>
+                <w:b/>
+                <w:bCs/>
+                <w:szCs w:val="40"/>
+              </w:rPr>
+              <w:t>NONE                          NONE                               NONE</w:t>
+            </w:r>
+          </w:p>
+        </w:tc>
+      </w:tr>
+    </w:tbl>
+    <w:p>
+      <w:pPr>
+        <w:spacing w:before="0" w:line="240" w:lineRule="auto"/>
+        <w:jc w:val="center"/>
+        <w:rPr>
+          <w:b/>
+          <w:bCs/>
+          <w:sz w:val="32"/>
+          <w:szCs w:val="32"/>
+          <w:u w:val="single"/>
+        </w:rPr>
+      </w:pPr>
+      <w:r>
+        <w:rPr>
+          <w:b/>
+          <w:bCs/>
+          <w:sz w:val="32"/>
+          <w:szCs w:val="32"/>
+          <w:u w:val="single"/>
+        </w:rPr>
+        <w:t>===================</w:t>
+      </w:r>
+    </w:p>
+    <w:p>
+      <w:pPr>
+        <w:spacing w:before="0" w:line="240" w:lineRule="auto"/>
+        <w:jc w:val="center"/>
+        <w:rPr>
+          <w:b/>
+          <w:bCs/>
+          <w:sz w:val="32"/>
+          <w:szCs w:val="32"/>
+          <w:u w:val="single"/>
+        </w:rPr>
+      </w:pPr>
+    </w:p>
     <w:p>
       <w:pPr>
         <w:spacing w:before="0" w:line="240" w:lineRule="auto"/>
@@ -404,27 +788,7 @@
                 <w:sz w:val="32"/>
                 <w:szCs w:val="40"/>
               </w:rPr>
-              <w:t>)</w:t>
-            </w:r>
-            <w:proofErr w:type="gramStart"/>
-            <w:r>
-              <w:rPr>
-                <w:rFonts w:ascii="BRH Malayalam Extra" w:hAnsi="BRH Malayalam Extra" w:cs="BRH Malayalam Extra"/>
-                <w:color w:val="000000"/>
-                <w:sz w:val="32"/>
-                <w:szCs w:val="40"/>
-              </w:rPr>
-              <w:t>-  Ad</w:t>
-            </w:r>
-            <w:proofErr w:type="gramEnd"/>
-            <w:r>
-              <w:rPr>
-                <w:rFonts w:ascii="BRH Malayalam Extra" w:hAnsi="BRH Malayalam Extra" w:cs="BRH Malayalam Extra"/>
-                <w:color w:val="000000"/>
-                <w:sz w:val="32"/>
-                <w:szCs w:val="40"/>
-              </w:rPr>
-              <w:t>¡— | Zûx</w:t>
+              <w:t>)-  Ad¡— | Zûx</w:t>
             </w:r>
             <w:r>
               <w:rPr>
@@ -651,27 +1015,7 @@
                 <w:sz w:val="32"/>
                 <w:szCs w:val="40"/>
               </w:rPr>
-              <w:t>)</w:t>
-            </w:r>
-            <w:proofErr w:type="gramStart"/>
-            <w:r>
-              <w:rPr>
-                <w:rFonts w:ascii="BRH Malayalam Extra" w:hAnsi="BRH Malayalam Extra" w:cs="BRH Malayalam Extra"/>
-                <w:color w:val="000000"/>
-                <w:sz w:val="32"/>
-                <w:szCs w:val="40"/>
-              </w:rPr>
-              <w:t>-  Ad</w:t>
-            </w:r>
-            <w:proofErr w:type="gramEnd"/>
-            <w:r>
-              <w:rPr>
-                <w:rFonts w:ascii="BRH Malayalam Extra" w:hAnsi="BRH Malayalam Extra" w:cs="BRH Malayalam Extra"/>
-                <w:color w:val="000000"/>
-                <w:sz w:val="32"/>
-                <w:szCs w:val="40"/>
-              </w:rPr>
-              <w:t>¡— | Zûx</w:t>
+              <w:t>)-  Ad¡— | Zûx</w:t>
             </w:r>
             <w:r>
               <w:rPr>
@@ -918,27 +1262,7 @@
                 <w:sz w:val="32"/>
                 <w:szCs w:val="40"/>
               </w:rPr>
-              <w:t>)</w:t>
-            </w:r>
-            <w:proofErr w:type="gramStart"/>
-            <w:r>
-              <w:rPr>
-                <w:rFonts w:ascii="BRH Malayalam Extra" w:hAnsi="BRH Malayalam Extra" w:cs="BRH Malayalam Extra"/>
-                <w:color w:val="000000"/>
-                <w:sz w:val="32"/>
-                <w:szCs w:val="40"/>
-              </w:rPr>
-              <w:t>-  Ad</w:t>
-            </w:r>
-            <w:proofErr w:type="gramEnd"/>
-            <w:r>
-              <w:rPr>
-                <w:rFonts w:ascii="BRH Malayalam Extra" w:hAnsi="BRH Malayalam Extra" w:cs="BRH Malayalam Extra"/>
-                <w:color w:val="000000"/>
-                <w:sz w:val="32"/>
-                <w:szCs w:val="40"/>
-              </w:rPr>
-              <w:t>¡— | Zûx</w:t>
+              <w:t>)-  Ad¡— | Zûx</w:t>
             </w:r>
             <w:r>
               <w:rPr>
@@ -1171,27 +1495,7 @@
                 <w:sz w:val="32"/>
                 <w:szCs w:val="40"/>
               </w:rPr>
-              <w:t>)</w:t>
-            </w:r>
-            <w:proofErr w:type="gramStart"/>
-            <w:r>
-              <w:rPr>
-                <w:rFonts w:ascii="BRH Malayalam Extra" w:hAnsi="BRH Malayalam Extra" w:cs="BRH Malayalam Extra"/>
-                <w:color w:val="000000"/>
-                <w:sz w:val="32"/>
-                <w:szCs w:val="40"/>
-              </w:rPr>
-              <w:t>-  Ad</w:t>
-            </w:r>
-            <w:proofErr w:type="gramEnd"/>
-            <w:r>
-              <w:rPr>
-                <w:rFonts w:ascii="BRH Malayalam Extra" w:hAnsi="BRH Malayalam Extra" w:cs="BRH Malayalam Extra"/>
-                <w:color w:val="000000"/>
-                <w:sz w:val="32"/>
-                <w:szCs w:val="40"/>
-              </w:rPr>
-              <w:t>¡— | Zûx</w:t>
+              <w:t>)-  Ad¡— | Zûx</w:t>
             </w:r>
             <w:r>
               <w:rPr>
@@ -1438,27 +1742,7 @@
                 <w:sz w:val="32"/>
                 <w:szCs w:val="40"/>
               </w:rPr>
-              <w:t>)</w:t>
-            </w:r>
-            <w:proofErr w:type="gramStart"/>
-            <w:r>
-              <w:rPr>
-                <w:rFonts w:ascii="BRH Malayalam Extra" w:hAnsi="BRH Malayalam Extra" w:cs="BRH Malayalam Extra"/>
-                <w:color w:val="000000"/>
-                <w:sz w:val="32"/>
-                <w:szCs w:val="40"/>
-              </w:rPr>
-              <w:t>-  Ad</w:t>
-            </w:r>
-            <w:proofErr w:type="gramEnd"/>
-            <w:r>
-              <w:rPr>
-                <w:rFonts w:ascii="BRH Malayalam Extra" w:hAnsi="BRH Malayalam Extra" w:cs="BRH Malayalam Extra"/>
-                <w:color w:val="000000"/>
-                <w:sz w:val="32"/>
-                <w:szCs w:val="40"/>
-              </w:rPr>
-              <w:t>¡— | Zûx</w:t>
+              <w:t>)-  Ad¡— | Zûx</w:t>
             </w:r>
             <w:r>
               <w:rPr>
@@ -1691,27 +1975,7 @@
                 <w:sz w:val="32"/>
                 <w:szCs w:val="40"/>
               </w:rPr>
-              <w:t>)</w:t>
-            </w:r>
-            <w:proofErr w:type="gramStart"/>
-            <w:r>
-              <w:rPr>
-                <w:rFonts w:ascii="BRH Malayalam Extra" w:hAnsi="BRH Malayalam Extra" w:cs="BRH Malayalam Extra"/>
-                <w:color w:val="000000"/>
-                <w:sz w:val="32"/>
-                <w:szCs w:val="40"/>
-              </w:rPr>
-              <w:t>-  Ad</w:t>
-            </w:r>
-            <w:proofErr w:type="gramEnd"/>
-            <w:r>
-              <w:rPr>
-                <w:rFonts w:ascii="BRH Malayalam Extra" w:hAnsi="BRH Malayalam Extra" w:cs="BRH Malayalam Extra"/>
-                <w:color w:val="000000"/>
-                <w:sz w:val="32"/>
-                <w:szCs w:val="40"/>
-              </w:rPr>
-              <w:t>¡— | Zûx</w:t>
+              <w:t>)-  Ad¡— | Zûx</w:t>
             </w:r>
             <w:r>
               <w:rPr>
@@ -1958,19 +2222,8 @@
                 <w:sz w:val="32"/>
                 <w:szCs w:val="40"/>
               </w:rPr>
-              <w:t>)</w:t>
-            </w:r>
-            <w:proofErr w:type="gramStart"/>
-            <w:r>
-              <w:rPr>
-                <w:rFonts w:ascii="BRH Malayalam Extra" w:hAnsi="BRH Malayalam Extra" w:cs="BRH Malayalam Extra"/>
-                <w:color w:val="000000"/>
-                <w:sz w:val="32"/>
-                <w:szCs w:val="40"/>
-              </w:rPr>
-              <w:t>-  A</w:t>
-            </w:r>
-            <w:proofErr w:type="gramEnd"/>
+              <w:t>)-  A</w:t>
+            </w:r>
             <w:r>
               <w:rPr>
                 <w:rFonts w:ascii="BRH Malayalam Extra" w:hAnsi="BRH Malayalam Extra" w:cs="BRH Malayalam Extra"/>
@@ -2155,19 +2408,8 @@
                 <w:sz w:val="32"/>
                 <w:szCs w:val="40"/>
               </w:rPr>
-              <w:t xml:space="preserve"> hõx</w:t>
-            </w:r>
-            <w:proofErr w:type="gramStart"/>
-            <w:r>
-              <w:rPr>
-                <w:rFonts w:ascii="BRH Malayalam Extra" w:hAnsi="BRH Malayalam Extra" w:cs="BRH Malayalam Extra"/>
-                <w:color w:val="000000"/>
-                <w:sz w:val="32"/>
-                <w:szCs w:val="40"/>
-              </w:rPr>
-              <w:t>˜(</w:t>
-            </w:r>
-            <w:proofErr w:type="gramEnd"/>
+              <w:t xml:space="preserve"> hõx˜(</w:t>
+            </w:r>
             <w:r>
               <w:rPr>
                 <w:rFonts w:cs="BRH Malayalam Extra"/>
@@ -2385,6 +2627,7 @@
                 <w:sz w:val="32"/>
                 <w:szCs w:val="40"/>
               </w:rPr>
+              <w:lastRenderedPageBreak/>
               <w:t>r¡—</w:t>
             </w:r>
             <w:r>
@@ -2530,19 +2773,8 @@
                 <w:sz w:val="32"/>
                 <w:szCs w:val="40"/>
               </w:rPr>
-              <w:t>)</w:t>
-            </w:r>
-            <w:proofErr w:type="gramStart"/>
-            <w:r>
-              <w:rPr>
-                <w:rFonts w:ascii="BRH Malayalam Extra" w:hAnsi="BRH Malayalam Extra" w:cs="BRH Malayalam Extra"/>
-                <w:color w:val="000000"/>
-                <w:sz w:val="32"/>
-                <w:szCs w:val="40"/>
-              </w:rPr>
-              <w:t>-  A</w:t>
-            </w:r>
-            <w:proofErr w:type="gramEnd"/>
+              <w:t>)-  A</w:t>
+            </w:r>
             <w:r>
               <w:rPr>
                 <w:rFonts w:ascii="BRH Malayalam Extra" w:hAnsi="BRH Malayalam Extra" w:cs="BRH Malayalam Extra"/>
@@ -2832,6 +3064,7 @@
                 <w:color w:val="000000"/>
                 <w:szCs w:val="40"/>
               </w:rPr>
+              <w:lastRenderedPageBreak/>
               <w:t>22</w:t>
             </w:r>
             <w:r>
@@ -2935,19 +3168,8 @@
                 <w:sz w:val="32"/>
                 <w:szCs w:val="40"/>
               </w:rPr>
-              <w:t>)</w:t>
-            </w:r>
-            <w:proofErr w:type="gramStart"/>
-            <w:r>
-              <w:rPr>
-                <w:rFonts w:ascii="BRH Malayalam Extra" w:hAnsi="BRH Malayalam Extra" w:cs="BRH Malayalam Extra"/>
-                <w:color w:val="000000"/>
-                <w:sz w:val="32"/>
-                <w:szCs w:val="40"/>
-              </w:rPr>
-              <w:t>-  A</w:t>
-            </w:r>
-            <w:proofErr w:type="gramEnd"/>
+              <w:t>)-  A</w:t>
+            </w:r>
             <w:r>
               <w:rPr>
                 <w:rFonts w:ascii="BRH Malayalam Extra" w:hAnsi="BRH Malayalam Extra" w:cs="BRH Malayalam Extra"/>
@@ -3132,19 +3354,8 @@
                 <w:sz w:val="32"/>
                 <w:szCs w:val="40"/>
               </w:rPr>
-              <w:t xml:space="preserve"> hõx</w:t>
-            </w:r>
-            <w:proofErr w:type="gramStart"/>
-            <w:r>
-              <w:rPr>
-                <w:rFonts w:ascii="BRH Malayalam Extra" w:hAnsi="BRH Malayalam Extra" w:cs="BRH Malayalam Extra"/>
-                <w:color w:val="000000"/>
-                <w:sz w:val="32"/>
-                <w:szCs w:val="40"/>
-              </w:rPr>
-              <w:t>˜(</w:t>
-            </w:r>
-            <w:proofErr w:type="gramEnd"/>
+              <w:t xml:space="preserve"> hõx˜(</w:t>
+            </w:r>
             <w:r>
               <w:rPr>
                 <w:rFonts w:cs="BRH Malayalam Extra"/>
@@ -3362,6 +3573,7 @@
                 <w:sz w:val="32"/>
                 <w:szCs w:val="40"/>
               </w:rPr>
+              <w:lastRenderedPageBreak/>
               <w:t>r¡—</w:t>
             </w:r>
             <w:r>
@@ -3507,19 +3719,8 @@
                 <w:sz w:val="32"/>
                 <w:szCs w:val="40"/>
               </w:rPr>
-              <w:t>)</w:t>
-            </w:r>
-            <w:proofErr w:type="gramStart"/>
-            <w:r>
-              <w:rPr>
-                <w:rFonts w:ascii="BRH Malayalam Extra" w:hAnsi="BRH Malayalam Extra" w:cs="BRH Malayalam Extra"/>
-                <w:color w:val="000000"/>
-                <w:sz w:val="32"/>
-                <w:szCs w:val="40"/>
-              </w:rPr>
-              <w:t>-  A</w:t>
-            </w:r>
-            <w:proofErr w:type="gramEnd"/>
+              <w:t>)-  A</w:t>
+            </w:r>
             <w:r>
               <w:rPr>
                 <w:rFonts w:ascii="BRH Malayalam Extra" w:hAnsi="BRH Malayalam Extra" w:cs="BRH Malayalam Extra"/>
@@ -3918,19 +4119,8 @@
                 <w:sz w:val="32"/>
                 <w:szCs w:val="40"/>
               </w:rPr>
-              <w:t>)</w:t>
-            </w:r>
-            <w:proofErr w:type="gramStart"/>
-            <w:r>
-              <w:rPr>
-                <w:rFonts w:ascii="BRH Malayalam Extra" w:hAnsi="BRH Malayalam Extra" w:cs="BRH Malayalam Extra"/>
-                <w:color w:val="000000"/>
-                <w:sz w:val="32"/>
-                <w:szCs w:val="40"/>
-              </w:rPr>
-              <w:t>-  B</w:t>
-            </w:r>
-            <w:proofErr w:type="gramEnd"/>
+              <w:t>)-  B</w:t>
+            </w:r>
             <w:r>
               <w:rPr>
                 <w:rFonts w:ascii="BRH Malayalam Extra" w:hAnsi="BRH Malayalam Extra" w:cs="BRH Malayalam Extra"/>
@@ -4427,19 +4617,8 @@
                 <w:sz w:val="32"/>
                 <w:szCs w:val="40"/>
               </w:rPr>
-              <w:t>)</w:t>
-            </w:r>
-            <w:proofErr w:type="gramStart"/>
-            <w:r>
-              <w:rPr>
-                <w:rFonts w:ascii="BRH Malayalam Extra" w:hAnsi="BRH Malayalam Extra" w:cs="BRH Malayalam Extra"/>
-                <w:color w:val="000000"/>
-                <w:sz w:val="32"/>
-                <w:szCs w:val="40"/>
-              </w:rPr>
-              <w:t>-  B</w:t>
-            </w:r>
-            <w:proofErr w:type="gramEnd"/>
+              <w:t>)-  B</w:t>
+            </w:r>
             <w:r>
               <w:rPr>
                 <w:rFonts w:ascii="BRH Malayalam Extra" w:hAnsi="BRH Malayalam Extra" w:cs="BRH Malayalam Extra"/>
@@ -4715,27 +4894,7 @@
                 <w:sz w:val="32"/>
                 <w:szCs w:val="40"/>
               </w:rPr>
-              <w:t>)</w:t>
-            </w:r>
-            <w:proofErr w:type="gramStart"/>
-            <w:r>
-              <w:rPr>
-                <w:rFonts w:ascii="BRH Malayalam Extra" w:hAnsi="BRH Malayalam Extra" w:cs="BRH Malayalam Extra"/>
-                <w:color w:val="000000"/>
-                <w:sz w:val="32"/>
-                <w:szCs w:val="40"/>
-              </w:rPr>
-              <w:t>-  ¥</w:t>
-            </w:r>
-            <w:proofErr w:type="gramEnd"/>
-            <w:r>
-              <w:rPr>
-                <w:rFonts w:ascii="BRH Malayalam Extra" w:hAnsi="BRH Malayalam Extra" w:cs="BRH Malayalam Extra"/>
-                <w:color w:val="000000"/>
-                <w:sz w:val="32"/>
-                <w:szCs w:val="40"/>
-              </w:rPr>
-              <w:t xml:space="preserve">Zd— | </w:t>
+              <w:t xml:space="preserve">)-  ¥Zd— | </w:t>
             </w:r>
             <w:r>
               <w:rPr>
@@ -5071,17 +5230,7 @@
                 <w:sz w:val="32"/>
                 <w:szCs w:val="40"/>
               </w:rPr>
-              <w:t>)</w:t>
-            </w:r>
-            <w:proofErr w:type="gramStart"/>
-            <w:r>
-              <w:rPr>
-                <w:rFonts w:ascii="BRH Malayalam Extra" w:hAnsi="BRH Malayalam Extra" w:cs="BRH Malayalam Extra"/>
-                <w:color w:val="000000"/>
-                <w:sz w:val="32"/>
-                <w:szCs w:val="40"/>
-              </w:rPr>
-              <w:t xml:space="preserve">-  </w:t>
+              <w:t xml:space="preserve">)-  </w:t>
             </w:r>
             <w:r>
               <w:rPr>
@@ -5091,18 +5240,7 @@
                 <w:szCs w:val="40"/>
                 <w:highlight w:val="yellow"/>
               </w:rPr>
-              <w:t>A</w:t>
-            </w:r>
-            <w:proofErr w:type="gramEnd"/>
-            <w:r>
-              <w:rPr>
-                <w:rFonts w:ascii="BRH Malayalam Extra" w:hAnsi="BRH Malayalam Extra" w:cs="BRH Malayalam Extra"/>
-                <w:color w:val="000000"/>
-                <w:sz w:val="32"/>
-                <w:szCs w:val="40"/>
-                <w:highlight w:val="yellow"/>
-              </w:rPr>
-              <w:t>(³§)—q¡</w:t>
+              <w:t>A(³§)—q¡</w:t>
             </w:r>
             <w:r>
               <w:rPr>
@@ -5214,6 +5352,7 @@
                 <w:szCs w:val="40"/>
                 <w:highlight w:val="yellow"/>
               </w:rPr>
+              <w:lastRenderedPageBreak/>
               <w:t>A(³§)—</w:t>
             </w:r>
             <w:r>
@@ -5471,28 +5610,12 @@
                 <w:szCs w:val="40"/>
               </w:rPr>
             </w:pPr>
-          </w:p>
-          <w:p>
-            <w:pPr>
-              <w:widowControl w:val="0"/>
-              <w:autoSpaceDE w:val="0"/>
-              <w:autoSpaceDN w:val="0"/>
-              <w:adjustRightInd w:val="0"/>
-              <w:spacing w:before="0" w:line="240" w:lineRule="auto"/>
-              <w:rPr>
-                <w:rFonts w:ascii="BRH Malayalam Extra" w:hAnsi="BRH Malayalam Extra" w:cs="BRH Malayalam Extra"/>
-                <w:color w:val="000000"/>
-                <w:sz w:val="32"/>
-                <w:szCs w:val="40"/>
-              </w:rPr>
-            </w:pPr>
-            <w:r>
-              <w:rPr>
-                <w:rFonts w:cs="BRH Malayalam Extra"/>
-                <w:color w:val="000000"/>
-                <w:szCs w:val="40"/>
-              </w:rPr>
-              <w:lastRenderedPageBreak/>
+            <w:r>
+              <w:rPr>
+                <w:rFonts w:cs="BRH Malayalam Extra"/>
+                <w:color w:val="000000"/>
+                <w:szCs w:val="40"/>
+              </w:rPr>
               <w:t>31</w:t>
             </w:r>
             <w:r>
@@ -5596,17 +5719,7 @@
                 <w:sz w:val="32"/>
                 <w:szCs w:val="40"/>
               </w:rPr>
-              <w:t>)</w:t>
-            </w:r>
-            <w:proofErr w:type="gramStart"/>
-            <w:r>
-              <w:rPr>
-                <w:rFonts w:ascii="BRH Malayalam Extra" w:hAnsi="BRH Malayalam Extra" w:cs="BRH Malayalam Extra"/>
-                <w:color w:val="000000"/>
-                <w:sz w:val="32"/>
-                <w:szCs w:val="40"/>
-              </w:rPr>
-              <w:t xml:space="preserve">-  </w:t>
+              <w:t xml:space="preserve">)-  </w:t>
             </w:r>
             <w:r>
               <w:rPr>
@@ -5616,18 +5729,7 @@
                 <w:szCs w:val="40"/>
                 <w:highlight w:val="yellow"/>
               </w:rPr>
-              <w:t>A</w:t>
-            </w:r>
-            <w:proofErr w:type="gramEnd"/>
-            <w:r>
-              <w:rPr>
-                <w:rFonts w:ascii="BRH Malayalam Extra" w:hAnsi="BRH Malayalam Extra" w:cs="BRH Malayalam Extra"/>
-                <w:color w:val="000000"/>
-                <w:sz w:val="32"/>
-                <w:szCs w:val="40"/>
-                <w:highlight w:val="yellow"/>
-              </w:rPr>
-              <w:t>(³§)—q¡</w:t>
+              <w:t>A(³§)—q¡</w:t>
             </w:r>
             <w:r>
               <w:rPr>
@@ -5851,19 +5953,8 @@
                 <w:sz w:val="32"/>
                 <w:szCs w:val="40"/>
               </w:rPr>
-              <w:t>)</w:t>
-            </w:r>
-            <w:proofErr w:type="gramStart"/>
-            <w:r>
-              <w:rPr>
-                <w:rFonts w:ascii="BRH Malayalam Extra" w:hAnsi="BRH Malayalam Extra" w:cs="BRH Malayalam Extra"/>
-                <w:color w:val="000000"/>
-                <w:sz w:val="32"/>
-                <w:szCs w:val="40"/>
-              </w:rPr>
-              <w:t>-  B</w:t>
-            </w:r>
-            <w:proofErr w:type="gramEnd"/>
+              <w:t>)-  B</w:t>
+            </w:r>
             <w:r>
               <w:rPr>
                 <w:rFonts w:ascii="BRH Malayalam Extra" w:hAnsi="BRH Malayalam Extra" w:cs="BRH Malayalam Extra"/>
@@ -6430,19 +6521,8 @@
                 <w:sz w:val="32"/>
                 <w:szCs w:val="40"/>
               </w:rPr>
-              <w:t>)</w:t>
-            </w:r>
-            <w:proofErr w:type="gramStart"/>
-            <w:r>
-              <w:rPr>
-                <w:rFonts w:ascii="BRH Malayalam Extra" w:hAnsi="BRH Malayalam Extra" w:cs="BRH Malayalam Extra"/>
-                <w:color w:val="000000"/>
-                <w:sz w:val="32"/>
-                <w:szCs w:val="40"/>
-              </w:rPr>
-              <w:t>-  B</w:t>
-            </w:r>
-            <w:proofErr w:type="gramEnd"/>
+              <w:t>)-  B</w:t>
+            </w:r>
             <w:r>
               <w:rPr>
                 <w:rFonts w:ascii="BRH Malayalam Extra" w:hAnsi="BRH Malayalam Extra" w:cs="BRH Malayalam Extra"/>
@@ -6728,27 +6808,7 @@
                 <w:sz w:val="32"/>
                 <w:szCs w:val="40"/>
               </w:rPr>
-              <w:t>)</w:t>
-            </w:r>
-            <w:proofErr w:type="gramStart"/>
-            <w:r>
-              <w:rPr>
-                <w:rFonts w:ascii="BRH Malayalam Extra" w:hAnsi="BRH Malayalam Extra" w:cs="BRH Malayalam Extra"/>
-                <w:color w:val="000000"/>
-                <w:sz w:val="32"/>
-                <w:szCs w:val="40"/>
-              </w:rPr>
-              <w:t>-  ¥</w:t>
-            </w:r>
-            <w:proofErr w:type="gramEnd"/>
-            <w:r>
-              <w:rPr>
-                <w:rFonts w:ascii="BRH Malayalam Extra" w:hAnsi="BRH Malayalam Extra" w:cs="BRH Malayalam Extra"/>
-                <w:color w:val="000000"/>
-                <w:sz w:val="32"/>
-                <w:szCs w:val="40"/>
-              </w:rPr>
-              <w:t xml:space="preserve">Zd— | </w:t>
+              <w:t xml:space="preserve">)-  ¥Zd— | </w:t>
             </w:r>
             <w:r>
               <w:rPr>
@@ -7177,17 +7237,7 @@
                 <w:sz w:val="32"/>
                 <w:szCs w:val="40"/>
               </w:rPr>
-              <w:t>)</w:t>
-            </w:r>
-            <w:proofErr w:type="gramStart"/>
-            <w:r>
-              <w:rPr>
-                <w:rFonts w:ascii="BRH Malayalam Extra" w:hAnsi="BRH Malayalam Extra" w:cs="BRH Malayalam Extra"/>
-                <w:color w:val="000000"/>
-                <w:sz w:val="32"/>
-                <w:szCs w:val="40"/>
-              </w:rPr>
-              <w:t xml:space="preserve">-  </w:t>
+              <w:t xml:space="preserve">)-  </w:t>
             </w:r>
             <w:r>
               <w:rPr>
@@ -7199,7 +7249,6 @@
               </w:rPr>
               <w:t>A</w:t>
             </w:r>
-            <w:proofErr w:type="gramEnd"/>
             <w:r>
               <w:rPr>
                 <w:rFonts w:ascii="BRH Malayalam Extra" w:hAnsi="BRH Malayalam Extra" w:cs="BRH Malayalam Extra"/>
@@ -7360,6 +7409,7 @@
                 <w:szCs w:val="40"/>
                 <w:highlight w:val="green"/>
               </w:rPr>
+              <w:lastRenderedPageBreak/>
               <w:t>A</w:t>
             </w:r>
             <w:r>
@@ -7689,28 +7739,12 @@
                 <w:szCs w:val="40"/>
               </w:rPr>
             </w:pPr>
-          </w:p>
-          <w:p>
-            <w:pPr>
-              <w:widowControl w:val="0"/>
-              <w:autoSpaceDE w:val="0"/>
-              <w:autoSpaceDN w:val="0"/>
-              <w:adjustRightInd w:val="0"/>
-              <w:spacing w:before="0" w:line="240" w:lineRule="auto"/>
-              <w:rPr>
-                <w:rFonts w:ascii="BRH Malayalam Extra" w:hAnsi="BRH Malayalam Extra" w:cs="BRH Malayalam Extra"/>
-                <w:color w:val="000000"/>
-                <w:sz w:val="32"/>
-                <w:szCs w:val="40"/>
-              </w:rPr>
-            </w:pPr>
-            <w:r>
-              <w:rPr>
-                <w:rFonts w:cs="BRH Malayalam Extra"/>
-                <w:color w:val="000000"/>
-                <w:szCs w:val="40"/>
-              </w:rPr>
-              <w:lastRenderedPageBreak/>
+            <w:r>
+              <w:rPr>
+                <w:rFonts w:cs="BRH Malayalam Extra"/>
+                <w:color w:val="000000"/>
+                <w:szCs w:val="40"/>
+              </w:rPr>
               <w:t>31</w:t>
             </w:r>
             <w:r>
@@ -7814,17 +7848,7 @@
                 <w:sz w:val="32"/>
                 <w:szCs w:val="40"/>
               </w:rPr>
-              <w:t>)</w:t>
-            </w:r>
-            <w:proofErr w:type="gramStart"/>
-            <w:r>
-              <w:rPr>
-                <w:rFonts w:ascii="BRH Malayalam Extra" w:hAnsi="BRH Malayalam Extra" w:cs="BRH Malayalam Extra"/>
-                <w:color w:val="000000"/>
-                <w:sz w:val="32"/>
-                <w:szCs w:val="40"/>
-              </w:rPr>
-              <w:t xml:space="preserve">-  </w:t>
+              <w:t xml:space="preserve">)-  </w:t>
             </w:r>
             <w:r>
               <w:rPr>
@@ -7836,7 +7860,6 @@
               </w:rPr>
               <w:t>A</w:t>
             </w:r>
-            <w:proofErr w:type="gramEnd"/>
             <w:r>
               <w:rPr>
                 <w:rFonts w:ascii="BRH Malayalam Extra" w:hAnsi="BRH Malayalam Extra" w:cs="BRH Malayalam Extra"/>
@@ -8114,19 +8137,8 @@
                 <w:sz w:val="32"/>
                 <w:szCs w:val="40"/>
               </w:rPr>
-              <w:t>)</w:t>
-            </w:r>
-            <w:proofErr w:type="gramStart"/>
-            <w:r>
-              <w:rPr>
-                <w:rFonts w:ascii="BRH Malayalam Extra" w:hAnsi="BRH Malayalam Extra" w:cs="BRH Malayalam Extra"/>
-                <w:color w:val="000000"/>
-                <w:sz w:val="32"/>
-                <w:szCs w:val="40"/>
-              </w:rPr>
-              <w:t>-  sx</w:t>
-            </w:r>
-            <w:proofErr w:type="gramEnd"/>
+              <w:t>)-  sx</w:t>
+            </w:r>
             <w:r>
               <w:rPr>
                 <w:rFonts w:ascii="BRH Malayalam Extra" w:hAnsi="BRH Malayalam Extra" w:cs="BRH Malayalam Extra"/>
@@ -8495,7 +8507,6 @@
               </w:rPr>
               <w:t>–</w:t>
             </w:r>
-            <w:proofErr w:type="gramStart"/>
             <w:r>
               <w:rPr>
                 <w:rFonts w:ascii="BRH Malayalam Extra" w:hAnsi="BRH Malayalam Extra" w:cs="BRH Malayalam Extra"/>
@@ -8504,18 +8515,7 @@
                 <w:szCs w:val="40"/>
                 <w:highlight w:val="yellow"/>
               </w:rPr>
-              <w:t>Kx(</w:t>
-            </w:r>
-            <w:proofErr w:type="gramEnd"/>
-            <w:r>
-              <w:rPr>
-                <w:rFonts w:ascii="BRH Malayalam Extra" w:hAnsi="BRH Malayalam Extra" w:cs="BRH Malayalam Extra"/>
-                <w:color w:val="000000"/>
-                <w:sz w:val="32"/>
-                <w:szCs w:val="40"/>
-                <w:highlight w:val="yellow"/>
-              </w:rPr>
-              <w:t>MÞ§)</w:t>
+              <w:t>Kx(MÞ§)</w:t>
             </w:r>
             <w:r>
               <w:rPr>
@@ -8770,19 +8770,8 @@
                 <w:sz w:val="32"/>
                 <w:szCs w:val="40"/>
               </w:rPr>
-              <w:t>)</w:t>
-            </w:r>
-            <w:proofErr w:type="gramStart"/>
-            <w:r>
-              <w:rPr>
-                <w:rFonts w:ascii="BRH Malayalam Extra" w:hAnsi="BRH Malayalam Extra" w:cs="BRH Malayalam Extra"/>
-                <w:color w:val="000000"/>
-                <w:sz w:val="32"/>
-                <w:szCs w:val="40"/>
-              </w:rPr>
-              <w:t>-  ey</w:t>
-            </w:r>
-            <w:proofErr w:type="gramEnd"/>
+              <w:t>)-  ey</w:t>
+            </w:r>
             <w:r>
               <w:rPr>
                 <w:rFonts w:ascii="BRH Malayalam Extra" w:hAnsi="BRH Malayalam Extra" w:cs="BRH Malayalam Extra"/>
@@ -9049,7 +9038,6 @@
               </w:rPr>
               <w:t>–</w:t>
             </w:r>
-            <w:proofErr w:type="gramStart"/>
             <w:r>
               <w:rPr>
                 <w:rFonts w:ascii="BRH Malayalam Extra" w:hAnsi="BRH Malayalam Extra" w:cs="BRH Malayalam Extra"/>
@@ -9058,18 +9046,7 @@
                 <w:szCs w:val="40"/>
                 <w:highlight w:val="yellow"/>
               </w:rPr>
-              <w:t>Kx(</w:t>
-            </w:r>
-            <w:proofErr w:type="gramEnd"/>
-            <w:r>
-              <w:rPr>
-                <w:rFonts w:ascii="BRH Malayalam Extra" w:hAnsi="BRH Malayalam Extra" w:cs="BRH Malayalam Extra"/>
-                <w:color w:val="000000"/>
-                <w:sz w:val="32"/>
-                <w:szCs w:val="40"/>
-                <w:highlight w:val="yellow"/>
-              </w:rPr>
-              <w:t>MÞ§)</w:t>
+              <w:t>Kx(MÞ§)</w:t>
             </w:r>
             <w:r>
               <w:rPr>
@@ -9138,27 +9115,7 @@
                 <w:sz w:val="32"/>
                 <w:szCs w:val="40"/>
               </w:rPr>
-              <w:t>¹I öZõ—</w:t>
-            </w:r>
-            <w:proofErr w:type="gramStart"/>
-            <w:r>
-              <w:rPr>
-                <w:rFonts w:ascii="BRH Malayalam Extra" w:hAnsi="BRH Malayalam Extra" w:cs="BRH Malayalam Extra"/>
-                <w:color w:val="000000"/>
-                <w:sz w:val="32"/>
-                <w:szCs w:val="40"/>
-              </w:rPr>
-              <w:t>IgKx(</w:t>
-            </w:r>
-            <w:proofErr w:type="gramEnd"/>
-            <w:r>
-              <w:rPr>
-                <w:rFonts w:ascii="BRH Malayalam Extra" w:hAnsi="BRH Malayalam Extra" w:cs="BRH Malayalam Extra"/>
-                <w:color w:val="000000"/>
-                <w:sz w:val="32"/>
-                <w:szCs w:val="40"/>
-              </w:rPr>
-              <w:t>MÞ§) së£Zzjsp</w:t>
+              <w:t>¹I öZõ—IgKx(MÞ§) së£Zzjsp</w:t>
             </w:r>
             <w:r>
               <w:rPr>
@@ -9194,7 +9151,17 @@
                 <w:sz w:val="32"/>
                 <w:szCs w:val="40"/>
               </w:rPr>
-              <w:t>dI öZõ—IgKx© eyZ£j</w:t>
+              <w:t xml:space="preserve">dI öZõ—IgKx© </w:t>
+            </w:r>
+            <w:r>
+              <w:rPr>
+                <w:rFonts w:ascii="BRH Malayalam Extra" w:hAnsi="BRH Malayalam Extra" w:cs="BRH Malayalam Extra"/>
+                <w:color w:val="000000"/>
+                <w:sz w:val="32"/>
+                <w:szCs w:val="40"/>
+              </w:rPr>
+              <w:lastRenderedPageBreak/>
+              <w:t>eyZ£j</w:t>
             </w:r>
             <w:r>
               <w:rPr>
@@ -9271,7 +9238,6 @@
                 <w:color w:val="000000"/>
                 <w:szCs w:val="40"/>
               </w:rPr>
-              <w:lastRenderedPageBreak/>
               <w:t>21</w:t>
             </w:r>
             <w:r>
@@ -9375,27 +9341,7 @@
                 <w:sz w:val="32"/>
                 <w:szCs w:val="40"/>
               </w:rPr>
-              <w:t>)</w:t>
-            </w:r>
-            <w:proofErr w:type="gramStart"/>
-            <w:r>
-              <w:rPr>
-                <w:rFonts w:ascii="BRH Malayalam Extra" w:hAnsi="BRH Malayalam Extra" w:cs="BRH Malayalam Extra"/>
-                <w:color w:val="000000"/>
-                <w:sz w:val="32"/>
-                <w:szCs w:val="40"/>
-              </w:rPr>
-              <w:t>-  öZõ</w:t>
-            </w:r>
-            <w:proofErr w:type="gramEnd"/>
-            <w:r>
-              <w:rPr>
-                <w:rFonts w:ascii="BRH Malayalam Extra" w:hAnsi="BRH Malayalam Extra" w:cs="BRH Malayalam Extra"/>
-                <w:color w:val="000000"/>
-                <w:sz w:val="32"/>
-                <w:szCs w:val="40"/>
-              </w:rPr>
-              <w:t>—IgKx© | Z£</w:t>
+              <w:t>)-  öZõ—IgKx© | Z£</w:t>
             </w:r>
             <w:r>
               <w:rPr>
@@ -9605,27 +9551,7 @@
                 <w:sz w:val="32"/>
                 <w:szCs w:val="40"/>
               </w:rPr>
-              <w:t>öZõ—</w:t>
-            </w:r>
-            <w:proofErr w:type="gramStart"/>
-            <w:r>
-              <w:rPr>
-                <w:rFonts w:ascii="BRH Malayalam Extra" w:hAnsi="BRH Malayalam Extra" w:cs="BRH Malayalam Extra"/>
-                <w:color w:val="000000"/>
-                <w:sz w:val="32"/>
-                <w:szCs w:val="40"/>
-              </w:rPr>
-              <w:t>IgKx(</w:t>
-            </w:r>
-            <w:proofErr w:type="gramEnd"/>
-            <w:r>
-              <w:rPr>
-                <w:rFonts w:ascii="BRH Malayalam Extra" w:hAnsi="BRH Malayalam Extra" w:cs="BRH Malayalam Extra"/>
-                <w:color w:val="000000"/>
-                <w:sz w:val="32"/>
-                <w:szCs w:val="40"/>
-              </w:rPr>
-              <w:t>MÞ§) së£Zzjsp</w:t>
+              <w:t>öZõ—IgKx(MÞ§) së£Zzjsp</w:t>
             </w:r>
             <w:r>
               <w:rPr>
@@ -9707,7 +9633,6 @@
               </w:rPr>
               <w:t>–</w:t>
             </w:r>
-            <w:proofErr w:type="gramStart"/>
             <w:r>
               <w:rPr>
                 <w:rFonts w:ascii="BRH Malayalam Extra" w:hAnsi="BRH Malayalam Extra" w:cs="BRH Malayalam Extra"/>
@@ -9716,18 +9641,7 @@
                 <w:szCs w:val="40"/>
                 <w:highlight w:val="yellow"/>
               </w:rPr>
-              <w:t>Kx(</w:t>
-            </w:r>
-            <w:proofErr w:type="gramEnd"/>
-            <w:r>
-              <w:rPr>
-                <w:rFonts w:ascii="BRH Malayalam Extra" w:hAnsi="BRH Malayalam Extra" w:cs="BRH Malayalam Extra"/>
-                <w:color w:val="000000"/>
-                <w:sz w:val="32"/>
-                <w:szCs w:val="40"/>
-                <w:highlight w:val="yellow"/>
-              </w:rPr>
-              <w:t>MÞ§)</w:t>
+              <w:t>Kx(MÞ§)</w:t>
             </w:r>
             <w:r>
               <w:rPr>
@@ -9817,7 +9731,6 @@
               </w:rPr>
               <w:t>–</w:t>
             </w:r>
-            <w:proofErr w:type="gramStart"/>
             <w:r>
               <w:rPr>
                 <w:rFonts w:ascii="BRH Malayalam Extra" w:hAnsi="BRH Malayalam Extra" w:cs="BRH Malayalam Extra"/>
@@ -9826,18 +9739,7 @@
                 <w:szCs w:val="40"/>
                 <w:highlight w:val="yellow"/>
               </w:rPr>
-              <w:t>Kx(</w:t>
-            </w:r>
-            <w:proofErr w:type="gramEnd"/>
-            <w:r>
-              <w:rPr>
-                <w:rFonts w:ascii="BRH Malayalam Extra" w:hAnsi="BRH Malayalam Extra" w:cs="BRH Malayalam Extra"/>
-                <w:color w:val="000000"/>
-                <w:sz w:val="32"/>
-                <w:szCs w:val="40"/>
-                <w:highlight w:val="yellow"/>
-              </w:rPr>
-              <w:t>MÞ§)</w:t>
+              <w:t>Kx(MÞ§)</w:t>
             </w:r>
             <w:r>
               <w:rPr>
@@ -10002,19 +9904,8 @@
                 <w:sz w:val="32"/>
                 <w:szCs w:val="40"/>
               </w:rPr>
-              <w:t>)</w:t>
-            </w:r>
-            <w:proofErr w:type="gramStart"/>
-            <w:r>
-              <w:rPr>
-                <w:rFonts w:ascii="BRH Malayalam Extra" w:hAnsi="BRH Malayalam Extra" w:cs="BRH Malayalam Extra"/>
-                <w:color w:val="000000"/>
-                <w:sz w:val="32"/>
-                <w:szCs w:val="40"/>
-              </w:rPr>
-              <w:t>-  sx</w:t>
-            </w:r>
-            <w:proofErr w:type="gramEnd"/>
+              <w:t>)-  sx</w:t>
+            </w:r>
             <w:r>
               <w:rPr>
                 <w:rFonts w:ascii="BRH Malayalam Extra" w:hAnsi="BRH Malayalam Extra" w:cs="BRH Malayalam Extra"/>
@@ -10656,19 +10547,8 @@
                 <w:sz w:val="32"/>
                 <w:szCs w:val="40"/>
               </w:rPr>
-              <w:t>)</w:t>
-            </w:r>
-            <w:proofErr w:type="gramStart"/>
-            <w:r>
-              <w:rPr>
-                <w:rFonts w:ascii="BRH Malayalam Extra" w:hAnsi="BRH Malayalam Extra" w:cs="BRH Malayalam Extra"/>
-                <w:color w:val="000000"/>
-                <w:sz w:val="32"/>
-                <w:szCs w:val="40"/>
-              </w:rPr>
-              <w:t>-  ey</w:t>
-            </w:r>
-            <w:proofErr w:type="gramEnd"/>
+              <w:t>)-  ey</w:t>
+            </w:r>
             <w:r>
               <w:rPr>
                 <w:rFonts w:ascii="BRH Malayalam Extra" w:hAnsi="BRH Malayalam Extra" w:cs="BRH Malayalam Extra"/>
@@ -11022,27 +10902,7 @@
                 <w:sz w:val="32"/>
                 <w:szCs w:val="40"/>
               </w:rPr>
-              <w:t>¹I öZõ—</w:t>
-            </w:r>
-            <w:proofErr w:type="gramStart"/>
-            <w:r>
-              <w:rPr>
-                <w:rFonts w:ascii="BRH Malayalam Extra" w:hAnsi="BRH Malayalam Extra" w:cs="BRH Malayalam Extra"/>
-                <w:color w:val="000000"/>
-                <w:sz w:val="32"/>
-                <w:szCs w:val="40"/>
-              </w:rPr>
-              <w:t>IgKx(</w:t>
-            </w:r>
-            <w:proofErr w:type="gramEnd"/>
-            <w:r>
-              <w:rPr>
-                <w:rFonts w:ascii="BRH Malayalam Extra" w:hAnsi="BRH Malayalam Extra" w:cs="BRH Malayalam Extra"/>
-                <w:color w:val="000000"/>
-                <w:sz w:val="32"/>
-                <w:szCs w:val="40"/>
-              </w:rPr>
-              <w:t>MÞ§) së£Zzjsp</w:t>
+              <w:t>¹I öZõ—IgKx(MÞ§) së£Zzjsp</w:t>
             </w:r>
             <w:r>
               <w:rPr>
@@ -11078,7 +10938,17 @@
                 <w:sz w:val="32"/>
                 <w:szCs w:val="40"/>
               </w:rPr>
-              <w:t>dI öZõ—IgKx© eyZ£j</w:t>
+              <w:t xml:space="preserve">dI öZõ—IgKx© </w:t>
+            </w:r>
+            <w:r>
+              <w:rPr>
+                <w:rFonts w:ascii="BRH Malayalam Extra" w:hAnsi="BRH Malayalam Extra" w:cs="BRH Malayalam Extra"/>
+                <w:color w:val="000000"/>
+                <w:sz w:val="32"/>
+                <w:szCs w:val="40"/>
+              </w:rPr>
+              <w:lastRenderedPageBreak/>
+              <w:t>eyZ£j</w:t>
             </w:r>
             <w:r>
               <w:rPr>
@@ -11155,7 +11025,6 @@
                 <w:color w:val="000000"/>
                 <w:szCs w:val="40"/>
               </w:rPr>
-              <w:lastRenderedPageBreak/>
               <w:t>21</w:t>
             </w:r>
             <w:r>
@@ -11259,27 +11128,7 @@
                 <w:sz w:val="32"/>
                 <w:szCs w:val="40"/>
               </w:rPr>
-              <w:t>)</w:t>
-            </w:r>
-            <w:proofErr w:type="gramStart"/>
-            <w:r>
-              <w:rPr>
-                <w:rFonts w:ascii="BRH Malayalam Extra" w:hAnsi="BRH Malayalam Extra" w:cs="BRH Malayalam Extra"/>
-                <w:color w:val="000000"/>
-                <w:sz w:val="32"/>
-                <w:szCs w:val="40"/>
-              </w:rPr>
-              <w:t>-  öZõ</w:t>
-            </w:r>
-            <w:proofErr w:type="gramEnd"/>
-            <w:r>
-              <w:rPr>
-                <w:rFonts w:ascii="BRH Malayalam Extra" w:hAnsi="BRH Malayalam Extra" w:cs="BRH Malayalam Extra"/>
-                <w:color w:val="000000"/>
-                <w:sz w:val="32"/>
-                <w:szCs w:val="40"/>
-              </w:rPr>
-              <w:t>—IgKx© | Z£</w:t>
+              <w:t>)-  öZõ—IgKx© | Z£</w:t>
             </w:r>
             <w:r>
               <w:rPr>
@@ -11489,27 +11338,7 @@
                 <w:sz w:val="32"/>
                 <w:szCs w:val="40"/>
               </w:rPr>
-              <w:t>öZõ—</w:t>
-            </w:r>
-            <w:proofErr w:type="gramStart"/>
-            <w:r>
-              <w:rPr>
-                <w:rFonts w:ascii="BRH Malayalam Extra" w:hAnsi="BRH Malayalam Extra" w:cs="BRH Malayalam Extra"/>
-                <w:color w:val="000000"/>
-                <w:sz w:val="32"/>
-                <w:szCs w:val="40"/>
-              </w:rPr>
-              <w:t>IgKx(</w:t>
-            </w:r>
-            <w:proofErr w:type="gramEnd"/>
-            <w:r>
-              <w:rPr>
-                <w:rFonts w:ascii="BRH Malayalam Extra" w:hAnsi="BRH Malayalam Extra" w:cs="BRH Malayalam Extra"/>
-                <w:color w:val="000000"/>
-                <w:sz w:val="32"/>
-                <w:szCs w:val="40"/>
-              </w:rPr>
-              <w:t>MÞ§) së£Zzjsp</w:t>
+              <w:t>öZõ—IgKx(MÞ§) së£Zzjsp</w:t>
             </w:r>
             <w:r>
               <w:rPr>
@@ -11618,27 +11447,7 @@
                 <w:sz w:val="32"/>
                 <w:szCs w:val="40"/>
               </w:rPr>
-              <w:t xml:space="preserve"> ösëõ—</w:t>
-            </w:r>
-            <w:proofErr w:type="gramStart"/>
-            <w:r>
-              <w:rPr>
-                <w:rFonts w:ascii="BRH Malayalam Extra" w:hAnsi="BRH Malayalam Extra" w:cs="BRH Malayalam Extra"/>
-                <w:color w:val="000000"/>
-                <w:sz w:val="32"/>
-                <w:szCs w:val="40"/>
-              </w:rPr>
-              <w:t>IgKx(</w:t>
-            </w:r>
-            <w:proofErr w:type="gramEnd"/>
-            <w:r>
-              <w:rPr>
-                <w:rFonts w:ascii="BRH Malayalam Extra" w:hAnsi="BRH Malayalam Extra" w:cs="BRH Malayalam Extra"/>
-                <w:color w:val="000000"/>
-                <w:sz w:val="32"/>
-                <w:szCs w:val="40"/>
-              </w:rPr>
-              <w:t>MÞ§) së£Zzjsp</w:t>
+              <w:t xml:space="preserve"> ösëõ—IgKx(MÞ§) së£Zzjsp</w:t>
             </w:r>
             <w:r>
               <w:rPr>
@@ -11746,27 +11555,7 @@
                 <w:sz w:val="32"/>
                 <w:szCs w:val="40"/>
               </w:rPr>
-              <w:t xml:space="preserve"> ösëõ—</w:t>
-            </w:r>
-            <w:proofErr w:type="gramStart"/>
-            <w:r>
-              <w:rPr>
-                <w:rFonts w:ascii="BRH Malayalam Extra" w:hAnsi="BRH Malayalam Extra" w:cs="BRH Malayalam Extra"/>
-                <w:color w:val="000000"/>
-                <w:sz w:val="32"/>
-                <w:szCs w:val="40"/>
-              </w:rPr>
-              <w:t>IgKx(</w:t>
-            </w:r>
-            <w:proofErr w:type="gramEnd"/>
-            <w:r>
-              <w:rPr>
-                <w:rFonts w:ascii="BRH Malayalam Extra" w:hAnsi="BRH Malayalam Extra" w:cs="BRH Malayalam Extra"/>
-                <w:color w:val="000000"/>
-                <w:sz w:val="32"/>
-                <w:szCs w:val="40"/>
-              </w:rPr>
-              <w:t>MÞ§) së£Zzjsp</w:t>
+              <w:t xml:space="preserve"> ösëõ—IgKx(MÞ§) së£Zzjsp</w:t>
             </w:r>
             <w:r>
               <w:rPr>
@@ -11936,27 +11725,7 @@
                 <w:sz w:val="32"/>
                 <w:szCs w:val="40"/>
               </w:rPr>
-              <w:t>)</w:t>
-            </w:r>
-            <w:proofErr w:type="gramStart"/>
-            <w:r>
-              <w:rPr>
-                <w:rFonts w:ascii="BRH Malayalam Extra" w:hAnsi="BRH Malayalam Extra" w:cs="BRH Malayalam Extra"/>
-                <w:color w:val="000000"/>
-                <w:sz w:val="32"/>
-                <w:szCs w:val="40"/>
-              </w:rPr>
-              <w:t>-  k</w:t>
-            </w:r>
-            <w:proofErr w:type="gramEnd"/>
-            <w:r>
-              <w:rPr>
-                <w:rFonts w:ascii="BRH Malayalam Extra" w:hAnsi="BRH Malayalam Extra" w:cs="BRH Malayalam Extra"/>
-                <w:color w:val="000000"/>
-                <w:sz w:val="32"/>
-                <w:szCs w:val="40"/>
-              </w:rPr>
-              <w:t>¡</w:t>
+              <w:t>)-  k¡</w:t>
             </w:r>
             <w:r>
               <w:rPr>
@@ -13157,6 +12926,7 @@
                 <w:szCs w:val="40"/>
                 <w:lang w:val="it-IT"/>
               </w:rPr>
+              <w:lastRenderedPageBreak/>
               <w:t>19</w:t>
             </w:r>
             <w:r>
@@ -13565,18 +13335,7 @@
                 <w:szCs w:val="40"/>
                 <w:lang w:val="it-IT"/>
               </w:rPr>
-              <w:t xml:space="preserve">— exty </w:t>
-            </w:r>
-            <w:r>
-              <w:rPr>
-                <w:rFonts w:ascii="BRH Malayalam Extra" w:hAnsi="BRH Malayalam Extra" w:cs="BRH Malayalam Extra"/>
-                <w:color w:val="000000"/>
-                <w:sz w:val="32"/>
-                <w:szCs w:val="40"/>
-                <w:lang w:val="it-IT"/>
-              </w:rPr>
-              <w:lastRenderedPageBreak/>
-              <w:t>exty ix</w:t>
+              <w:t>— exty exty ix</w:t>
             </w:r>
             <w:r>
               <w:rPr>
@@ -15235,6 +14994,7 @@
                 <w:szCs w:val="40"/>
                 <w:lang w:val="it-IT"/>
               </w:rPr>
+              <w:lastRenderedPageBreak/>
               <w:t>19</w:t>
             </w:r>
             <w:r>
@@ -15592,18 +15352,7 @@
                 <w:szCs w:val="40"/>
                 <w:lang w:val="it-IT"/>
               </w:rPr>
-              <w:t xml:space="preserve"> exty </w:t>
-            </w:r>
-            <w:r>
-              <w:rPr>
-                <w:rFonts w:ascii="BRH Malayalam Extra" w:hAnsi="BRH Malayalam Extra" w:cs="BRH Malayalam Extra"/>
-                <w:color w:val="000000"/>
-                <w:sz w:val="32"/>
-                <w:szCs w:val="40"/>
-                <w:lang w:val="it-IT"/>
-              </w:rPr>
-              <w:lastRenderedPageBreak/>
-              <w:t>exty ix</w:t>
+              <w:t xml:space="preserve"> exty exty ix</w:t>
             </w:r>
             <w:r>
               <w:rPr>
@@ -16936,27 +16685,7 @@
                 <w:sz w:val="32"/>
                 <w:szCs w:val="40"/>
               </w:rPr>
-              <w:t>)</w:t>
-            </w:r>
-            <w:proofErr w:type="gramStart"/>
-            <w:r>
-              <w:rPr>
-                <w:rFonts w:ascii="BRH Malayalam Extra" w:hAnsi="BRH Malayalam Extra" w:cs="BRH Malayalam Extra"/>
-                <w:color w:val="000000"/>
-                <w:sz w:val="32"/>
-                <w:szCs w:val="40"/>
-              </w:rPr>
-              <w:t>-  B</w:t>
-            </w:r>
-            <w:proofErr w:type="gramEnd"/>
-            <w:r>
-              <w:rPr>
-                <w:rFonts w:ascii="BRH Malayalam Extra" w:hAnsi="BRH Malayalam Extra" w:cs="BRH Malayalam Extra"/>
-                <w:color w:val="000000"/>
-                <w:sz w:val="32"/>
-                <w:szCs w:val="40"/>
-              </w:rPr>
-              <w:t xml:space="preserve"> | E</w:t>
+              <w:t>)-  B | E</w:t>
             </w:r>
             <w:r>
               <w:rPr>
@@ -17318,27 +17047,7 @@
                 <w:sz w:val="32"/>
                 <w:szCs w:val="40"/>
               </w:rPr>
-              <w:t>)</w:t>
-            </w:r>
-            <w:proofErr w:type="gramStart"/>
-            <w:r>
-              <w:rPr>
-                <w:rFonts w:ascii="BRH Malayalam Extra" w:hAnsi="BRH Malayalam Extra" w:cs="BRH Malayalam Extra"/>
-                <w:color w:val="000000"/>
-                <w:sz w:val="32"/>
-                <w:szCs w:val="40"/>
-              </w:rPr>
-              <w:t>-  B</w:t>
-            </w:r>
-            <w:proofErr w:type="gramEnd"/>
-            <w:r>
-              <w:rPr>
-                <w:rFonts w:ascii="BRH Malayalam Extra" w:hAnsi="BRH Malayalam Extra" w:cs="BRH Malayalam Extra"/>
-                <w:color w:val="000000"/>
-                <w:sz w:val="32"/>
-                <w:szCs w:val="40"/>
-              </w:rPr>
-              <w:t xml:space="preserve"> | E</w:t>
+              <w:t>)-  B | E</w:t>
             </w:r>
             <w:r>
               <w:rPr>
@@ -17732,19 +17441,8 @@
                 <w:sz w:val="32"/>
                 <w:szCs w:val="40"/>
               </w:rPr>
-              <w:t>)</w:t>
-            </w:r>
-            <w:proofErr w:type="gramStart"/>
-            <w:r>
-              <w:rPr>
-                <w:rFonts w:ascii="BRH Malayalam Extra" w:hAnsi="BRH Malayalam Extra" w:cs="BRH Malayalam Extra"/>
-                <w:color w:val="000000"/>
-                <w:sz w:val="32"/>
-                <w:szCs w:val="40"/>
-              </w:rPr>
-              <w:t>-  ög</w:t>
-            </w:r>
-            <w:proofErr w:type="gramEnd"/>
+              <w:t>)-  ög</w:t>
+            </w:r>
             <w:r>
               <w:rPr>
                 <w:rFonts w:ascii="BRH Malayalam Extra" w:hAnsi="BRH Malayalam Extra" w:cs="BRH Malayalam Extra"/>
@@ -18156,19 +17854,8 @@
                 <w:sz w:val="32"/>
                 <w:szCs w:val="40"/>
               </w:rPr>
-              <w:t>)</w:t>
-            </w:r>
-            <w:proofErr w:type="gramStart"/>
-            <w:r>
-              <w:rPr>
-                <w:rFonts w:ascii="BRH Malayalam Extra" w:hAnsi="BRH Malayalam Extra" w:cs="BRH Malayalam Extra"/>
-                <w:color w:val="000000"/>
-                <w:sz w:val="32"/>
-                <w:szCs w:val="40"/>
-              </w:rPr>
-              <w:t>-  ög</w:t>
-            </w:r>
-            <w:proofErr w:type="gramEnd"/>
+              <w:t>)-  ög</w:t>
+            </w:r>
             <w:r>
               <w:rPr>
                 <w:rFonts w:ascii="BRH Malayalam Extra" w:hAnsi="BRH Malayalam Extra" w:cs="BRH Malayalam Extra"/>
@@ -18825,7 +18512,18 @@
                 <w:szCs w:val="40"/>
                 <w:lang w:val="it-IT"/>
               </w:rPr>
-              <w:t>Z i£—ZexJ s¡pªpxU§ a§</w:t>
+              <w:t xml:space="preserve">Z i£—ZexJ s¡pªpxU§ </w:t>
+            </w:r>
+            <w:r>
+              <w:rPr>
+                <w:rFonts w:ascii="BRH Malayalam Extra" w:hAnsi="BRH Malayalam Extra" w:cs="BRH Malayalam Extra"/>
+                <w:color w:val="000000"/>
+                <w:sz w:val="32"/>
+                <w:szCs w:val="40"/>
+                <w:lang w:val="it-IT"/>
+              </w:rPr>
+              <w:lastRenderedPageBreak/>
+              <w:t>a§</w:t>
             </w:r>
             <w:r>
               <w:rPr>
@@ -18914,30 +18612,13 @@
               </w:rPr>
               <w:t xml:space="preserve"> </w:t>
             </w:r>
-          </w:p>
-          <w:p>
-            <w:pPr>
-              <w:widowControl w:val="0"/>
-              <w:autoSpaceDE w:val="0"/>
-              <w:autoSpaceDN w:val="0"/>
-              <w:adjustRightInd w:val="0"/>
-              <w:spacing w:before="0" w:line="240" w:lineRule="auto"/>
-              <w:rPr>
-                <w:rFonts w:ascii="BRH Malayalam Extra" w:hAnsi="BRH Malayalam Extra" w:cs="BRH Malayalam Extra"/>
-                <w:color w:val="000000"/>
-                <w:sz w:val="32"/>
-                <w:szCs w:val="40"/>
-                <w:lang w:val="it-IT"/>
-              </w:rPr>
-            </w:pPr>
-            <w:r>
-              <w:rPr>
-                <w:rFonts w:cs="BRH Malayalam Extra"/>
-                <w:color w:val="000000"/>
-                <w:szCs w:val="40"/>
-                <w:lang w:val="it-IT"/>
-              </w:rPr>
-              <w:lastRenderedPageBreak/>
+            <w:r>
+              <w:rPr>
+                <w:rFonts w:cs="BRH Malayalam Extra"/>
+                <w:color w:val="000000"/>
+                <w:szCs w:val="40"/>
+                <w:lang w:val="it-IT"/>
+              </w:rPr>
               <w:t>48</w:t>
             </w:r>
             <w:r>
@@ -20276,7 +19957,18 @@
                 <w:szCs w:val="40"/>
                 <w:lang w:val="it-IT"/>
               </w:rPr>
-              <w:t>Z i£—ZexJ s¡pªpxU§ a§</w:t>
+              <w:t xml:space="preserve">Z i£—ZexJ s¡pªpxU§ </w:t>
+            </w:r>
+            <w:r>
+              <w:rPr>
+                <w:rFonts w:ascii="BRH Malayalam Extra" w:hAnsi="BRH Malayalam Extra" w:cs="BRH Malayalam Extra"/>
+                <w:color w:val="000000"/>
+                <w:sz w:val="32"/>
+                <w:szCs w:val="40"/>
+                <w:lang w:val="it-IT"/>
+              </w:rPr>
+              <w:lastRenderedPageBreak/>
+              <w:t>a§</w:t>
             </w:r>
             <w:r>
               <w:rPr>
@@ -20355,30 +20047,13 @@
                 <w:lang w:val="it-IT"/>
               </w:rPr>
             </w:pPr>
-          </w:p>
-          <w:p>
-            <w:pPr>
-              <w:widowControl w:val="0"/>
-              <w:autoSpaceDE w:val="0"/>
-              <w:autoSpaceDN w:val="0"/>
-              <w:adjustRightInd w:val="0"/>
-              <w:spacing w:before="0" w:line="240" w:lineRule="auto"/>
-              <w:rPr>
-                <w:rFonts w:ascii="BRH Malayalam Extra" w:hAnsi="BRH Malayalam Extra" w:cs="BRH Malayalam Extra"/>
-                <w:color w:val="000000"/>
-                <w:sz w:val="32"/>
-                <w:szCs w:val="40"/>
-                <w:lang w:val="it-IT"/>
-              </w:rPr>
-            </w:pPr>
-            <w:r>
-              <w:rPr>
-                <w:rFonts w:cs="BRH Malayalam Extra"/>
-                <w:color w:val="000000"/>
-                <w:szCs w:val="40"/>
-                <w:lang w:val="it-IT"/>
-              </w:rPr>
-              <w:lastRenderedPageBreak/>
+            <w:r>
+              <w:rPr>
+                <w:rFonts w:cs="BRH Malayalam Extra"/>
+                <w:color w:val="000000"/>
+                <w:szCs w:val="40"/>
+                <w:lang w:val="it-IT"/>
+              </w:rPr>
               <w:t>48</w:t>
             </w:r>
             <w:r>
@@ -22484,9 +22159,8 @@
               <w:adjustRightInd w:val="0"/>
               <w:spacing w:before="0" w:line="240" w:lineRule="auto"/>
               <w:rPr>
-                <w:rFonts w:ascii="BRH Malayalam Extra" w:hAnsi="BRH Malayalam Extra" w:cs="BRH Malayalam Extra"/>
-                <w:color w:val="000000"/>
-                <w:sz w:val="32"/>
+                <w:rFonts w:cs="BRH Malayalam Extra"/>
+                <w:color w:val="FF0000"/>
                 <w:szCs w:val="40"/>
                 <w:lang w:val="it-IT"/>
               </w:rPr>
@@ -22521,22 +22195,6 @@
               </w:rPr>
               <w:t xml:space="preserve">K£Z—J | </w:t>
             </w:r>
-          </w:p>
-          <w:p>
-            <w:pPr>
-              <w:widowControl w:val="0"/>
-              <w:autoSpaceDE w:val="0"/>
-              <w:autoSpaceDN w:val="0"/>
-              <w:adjustRightInd w:val="0"/>
-              <w:spacing w:before="0" w:line="240" w:lineRule="auto"/>
-              <w:ind w:right="-279"/>
-              <w:rPr>
-                <w:rFonts w:cs="BRH Malayalam Extra"/>
-                <w:color w:val="FF0000"/>
-                <w:szCs w:val="40"/>
-                <w:lang w:val="it-IT"/>
-              </w:rPr>
-            </w:pPr>
           </w:p>
         </w:tc>
         <w:tc>
@@ -23402,9 +23060,8 @@
               <w:adjustRightInd w:val="0"/>
               <w:spacing w:before="0" w:line="240" w:lineRule="auto"/>
               <w:rPr>
-                <w:rFonts w:ascii="BRH Malayalam Extra" w:hAnsi="BRH Malayalam Extra" w:cs="BRH Malayalam Extra"/>
-                <w:color w:val="000000"/>
-                <w:sz w:val="32"/>
+                <w:rFonts w:cs="BRH Malayalam Extra"/>
+                <w:color w:val="FF0000"/>
                 <w:szCs w:val="40"/>
                 <w:lang w:val="it-IT"/>
               </w:rPr>
@@ -23439,22 +23096,6 @@
               </w:rPr>
               <w:t xml:space="preserve">K£Z—J | </w:t>
             </w:r>
-          </w:p>
-          <w:p>
-            <w:pPr>
-              <w:widowControl w:val="0"/>
-              <w:autoSpaceDE w:val="0"/>
-              <w:autoSpaceDN w:val="0"/>
-              <w:adjustRightInd w:val="0"/>
-              <w:spacing w:before="0" w:line="240" w:lineRule="auto"/>
-              <w:ind w:right="-279"/>
-              <w:rPr>
-                <w:rFonts w:cs="BRH Malayalam Extra"/>
-                <w:color w:val="FF0000"/>
-                <w:szCs w:val="40"/>
-                <w:lang w:val="it-IT"/>
-              </w:rPr>
-            </w:pPr>
           </w:p>
         </w:tc>
       </w:tr>
@@ -23596,27 +23237,7 @@
                 <w:sz w:val="32"/>
                 <w:szCs w:val="40"/>
               </w:rPr>
-              <w:t>)</w:t>
-            </w:r>
-            <w:proofErr w:type="gramStart"/>
-            <w:r>
-              <w:rPr>
-                <w:rFonts w:ascii="BRH Malayalam Extra" w:hAnsi="BRH Malayalam Extra" w:cs="BRH Malayalam Extra"/>
-                <w:color w:val="000000"/>
-                <w:sz w:val="32"/>
-                <w:szCs w:val="40"/>
-              </w:rPr>
-              <w:t>-  Asy</w:t>
-            </w:r>
-            <w:proofErr w:type="gramEnd"/>
-            <w:r>
-              <w:rPr>
-                <w:rFonts w:ascii="BRH Malayalam Extra" w:hAnsi="BRH Malayalam Extra" w:cs="BRH Malayalam Extra"/>
-                <w:color w:val="000000"/>
-                <w:sz w:val="32"/>
-                <w:szCs w:val="40"/>
-              </w:rPr>
-              <w:t xml:space="preserve">—PZ§ | sÉ¡—M§cI | </w:t>
+              <w:t xml:space="preserve">)-  Asy—PZ§ | sÉ¡—M§cI | </w:t>
             </w:r>
             <w:r>
               <w:rPr>
@@ -24041,27 +23662,7 @@
                 <w:sz w:val="32"/>
                 <w:szCs w:val="40"/>
               </w:rPr>
-              <w:t>)</w:t>
-            </w:r>
-            <w:proofErr w:type="gramStart"/>
-            <w:r>
-              <w:rPr>
-                <w:rFonts w:ascii="BRH Malayalam Extra" w:hAnsi="BRH Malayalam Extra" w:cs="BRH Malayalam Extra"/>
-                <w:color w:val="000000"/>
-                <w:sz w:val="32"/>
-                <w:szCs w:val="40"/>
-              </w:rPr>
-              <w:t>-  sÉ</w:t>
-            </w:r>
-            <w:proofErr w:type="gramEnd"/>
-            <w:r>
-              <w:rPr>
-                <w:rFonts w:ascii="BRH Malayalam Extra" w:hAnsi="BRH Malayalam Extra" w:cs="BRH Malayalam Extra"/>
-                <w:color w:val="000000"/>
-                <w:sz w:val="32"/>
-                <w:szCs w:val="40"/>
-              </w:rPr>
-              <w:t xml:space="preserve">¡—M§cI | </w:t>
+              <w:t xml:space="preserve">)-  sÉ¡—M§cI | </w:t>
             </w:r>
             <w:r>
               <w:rPr>
@@ -24546,17 +24147,7 @@
                 <w:sz w:val="32"/>
                 <w:szCs w:val="40"/>
               </w:rPr>
-              <w:t>)</w:t>
-            </w:r>
-            <w:proofErr w:type="gramStart"/>
-            <w:r>
-              <w:rPr>
-                <w:rFonts w:ascii="BRH Malayalam Extra" w:hAnsi="BRH Malayalam Extra" w:cs="BRH Malayalam Extra"/>
-                <w:color w:val="000000"/>
-                <w:sz w:val="32"/>
-                <w:szCs w:val="40"/>
-              </w:rPr>
-              <w:t xml:space="preserve">-  </w:t>
+              <w:t xml:space="preserve">)-  </w:t>
             </w:r>
             <w:r>
               <w:rPr>
@@ -24566,18 +24157,7 @@
                 <w:szCs w:val="40"/>
                 <w:highlight w:val="yellow"/>
               </w:rPr>
-              <w:t>K</w:t>
-            </w:r>
-            <w:proofErr w:type="gramEnd"/>
-            <w:r>
-              <w:rPr>
-                <w:rFonts w:ascii="BRH Malayalam Extra" w:hAnsi="BRH Malayalam Extra" w:cs="BRH Malayalam Extra"/>
-                <w:color w:val="000000"/>
-                <w:sz w:val="32"/>
-                <w:szCs w:val="40"/>
-                <w:highlight w:val="yellow"/>
-              </w:rPr>
-              <w:t>¡</w:t>
+              <w:t>K¡</w:t>
             </w:r>
             <w:r>
               <w:rPr>
@@ -25033,27 +24613,7 @@
                 <w:sz w:val="32"/>
                 <w:szCs w:val="40"/>
               </w:rPr>
-              <w:t>)</w:t>
-            </w:r>
-            <w:proofErr w:type="gramStart"/>
-            <w:r>
-              <w:rPr>
-                <w:rFonts w:ascii="BRH Malayalam Extra" w:hAnsi="BRH Malayalam Extra" w:cs="BRH Malayalam Extra"/>
-                <w:color w:val="000000"/>
-                <w:sz w:val="32"/>
-                <w:szCs w:val="40"/>
-              </w:rPr>
-              <w:t>-  Asy</w:t>
-            </w:r>
-            <w:proofErr w:type="gramEnd"/>
-            <w:r>
-              <w:rPr>
-                <w:rFonts w:ascii="BRH Malayalam Extra" w:hAnsi="BRH Malayalam Extra" w:cs="BRH Malayalam Extra"/>
-                <w:color w:val="000000"/>
-                <w:sz w:val="32"/>
-                <w:szCs w:val="40"/>
-              </w:rPr>
-              <w:t xml:space="preserve">—PZ§ | sÉ¡—M§cI | </w:t>
+              <w:t xml:space="preserve">)-  Asy—PZ§ | sÉ¡—M§cI | </w:t>
             </w:r>
             <w:r>
               <w:rPr>
@@ -25523,27 +25083,7 @@
                 <w:sz w:val="32"/>
                 <w:szCs w:val="40"/>
               </w:rPr>
-              <w:t>)</w:t>
-            </w:r>
-            <w:proofErr w:type="gramStart"/>
-            <w:r>
-              <w:rPr>
-                <w:rFonts w:ascii="BRH Malayalam Extra" w:hAnsi="BRH Malayalam Extra" w:cs="BRH Malayalam Extra"/>
-                <w:color w:val="000000"/>
-                <w:sz w:val="32"/>
-                <w:szCs w:val="40"/>
-              </w:rPr>
-              <w:t>-  sÉ</w:t>
-            </w:r>
-            <w:proofErr w:type="gramEnd"/>
-            <w:r>
-              <w:rPr>
-                <w:rFonts w:ascii="BRH Malayalam Extra" w:hAnsi="BRH Malayalam Extra" w:cs="BRH Malayalam Extra"/>
-                <w:color w:val="000000"/>
-                <w:sz w:val="32"/>
-                <w:szCs w:val="40"/>
-              </w:rPr>
-              <w:t xml:space="preserve">¡—M§cI | </w:t>
+              <w:t xml:space="preserve">)-  sÉ¡—M§cI | </w:t>
             </w:r>
             <w:r>
               <w:rPr>
@@ -26079,17 +25619,7 @@
                 <w:sz w:val="32"/>
                 <w:szCs w:val="40"/>
               </w:rPr>
-              <w:t>)</w:t>
-            </w:r>
-            <w:proofErr w:type="gramStart"/>
-            <w:r>
-              <w:rPr>
-                <w:rFonts w:ascii="BRH Malayalam Extra" w:hAnsi="BRH Malayalam Extra" w:cs="BRH Malayalam Extra"/>
-                <w:color w:val="000000"/>
-                <w:sz w:val="32"/>
-                <w:szCs w:val="40"/>
-              </w:rPr>
-              <w:t xml:space="preserve">-  </w:t>
+              <w:t xml:space="preserve">)-  </w:t>
             </w:r>
             <w:r>
               <w:rPr>
@@ -26099,18 +25629,7 @@
                 <w:szCs w:val="40"/>
                 <w:highlight w:val="green"/>
               </w:rPr>
-              <w:t>K</w:t>
-            </w:r>
-            <w:proofErr w:type="gramEnd"/>
-            <w:r>
-              <w:rPr>
-                <w:rFonts w:ascii="BRH Malayalam Extra" w:hAnsi="BRH Malayalam Extra" w:cs="BRH Malayalam Extra"/>
-                <w:color w:val="000000"/>
-                <w:sz w:val="32"/>
-                <w:szCs w:val="40"/>
-                <w:highlight w:val="green"/>
-              </w:rPr>
-              <w:t>¡</w:t>
+              <w:t>K¡</w:t>
             </w:r>
             <w:r>
               <w:rPr>
@@ -26640,19 +26159,8 @@
                 <w:sz w:val="32"/>
                 <w:szCs w:val="40"/>
               </w:rPr>
-              <w:t>)</w:t>
-            </w:r>
-            <w:proofErr w:type="gramStart"/>
-            <w:r>
-              <w:rPr>
-                <w:rFonts w:ascii="BRH Malayalam Extra" w:hAnsi="BRH Malayalam Extra" w:cs="BRH Malayalam Extra"/>
-                <w:color w:val="000000"/>
-                <w:sz w:val="32"/>
-                <w:szCs w:val="40"/>
-              </w:rPr>
-              <w:t>-  B</w:t>
-            </w:r>
-            <w:proofErr w:type="gramEnd"/>
+              <w:t>)-  B</w:t>
+            </w:r>
             <w:r>
               <w:rPr>
                 <w:rFonts w:ascii="BRH Malayalam Extra" w:hAnsi="BRH Malayalam Extra" w:cs="BRH Malayalam Extra"/>
@@ -27131,19 +26639,8 @@
                 <w:sz w:val="32"/>
                 <w:szCs w:val="40"/>
               </w:rPr>
-              <w:t>)</w:t>
-            </w:r>
-            <w:proofErr w:type="gramStart"/>
-            <w:r>
-              <w:rPr>
-                <w:rFonts w:ascii="BRH Malayalam Extra" w:hAnsi="BRH Malayalam Extra" w:cs="BRH Malayalam Extra"/>
-                <w:color w:val="000000"/>
-                <w:sz w:val="32"/>
-                <w:szCs w:val="40"/>
-              </w:rPr>
-              <w:t>-  s</w:t>
-            </w:r>
-            <w:proofErr w:type="gramEnd"/>
+              <w:t>)-  s</w:t>
+            </w:r>
             <w:r>
               <w:rPr>
                 <w:rFonts w:ascii="BRH Malayalam Extra" w:hAnsi="BRH Malayalam Extra" w:cs="BRH Malayalam Extra"/>
@@ -27604,17 +27101,7 @@
                 <w:sz w:val="32"/>
                 <w:szCs w:val="40"/>
               </w:rPr>
-              <w:t>)</w:t>
-            </w:r>
-            <w:proofErr w:type="gramStart"/>
-            <w:r>
-              <w:rPr>
-                <w:rFonts w:ascii="BRH Malayalam Extra" w:hAnsi="BRH Malayalam Extra" w:cs="BRH Malayalam Extra"/>
-                <w:color w:val="000000"/>
-                <w:sz w:val="32"/>
-                <w:szCs w:val="40"/>
-              </w:rPr>
-              <w:t xml:space="preserve">-  </w:t>
+              <w:t xml:space="preserve">)-  </w:t>
             </w:r>
             <w:r>
               <w:rPr>
@@ -27624,18 +27111,7 @@
                 <w:szCs w:val="40"/>
                 <w:highlight w:val="yellow"/>
               </w:rPr>
-              <w:t>K</w:t>
-            </w:r>
-            <w:proofErr w:type="gramEnd"/>
-            <w:r>
-              <w:rPr>
-                <w:rFonts w:ascii="BRH Malayalam Extra" w:hAnsi="BRH Malayalam Extra" w:cs="BRH Malayalam Extra"/>
-                <w:color w:val="000000"/>
-                <w:sz w:val="32"/>
-                <w:szCs w:val="40"/>
-                <w:highlight w:val="yellow"/>
-              </w:rPr>
-              <w:t>¡</w:t>
+              <w:t>K¡</w:t>
             </w:r>
             <w:r>
               <w:rPr>
@@ -27909,19 +27385,8 @@
                 <w:sz w:val="32"/>
                 <w:szCs w:val="40"/>
               </w:rPr>
-              <w:t>)</w:t>
-            </w:r>
-            <w:proofErr w:type="gramStart"/>
-            <w:r>
-              <w:rPr>
-                <w:rFonts w:ascii="BRH Malayalam Extra" w:hAnsi="BRH Malayalam Extra" w:cs="BRH Malayalam Extra"/>
-                <w:color w:val="000000"/>
-                <w:sz w:val="32"/>
-                <w:szCs w:val="40"/>
-              </w:rPr>
-              <w:t>-  B</w:t>
-            </w:r>
-            <w:proofErr w:type="gramEnd"/>
+              <w:t>)-  B</w:t>
+            </w:r>
             <w:r>
               <w:rPr>
                 <w:rFonts w:ascii="BRH Malayalam Extra" w:hAnsi="BRH Malayalam Extra" w:cs="BRH Malayalam Extra"/>
@@ -28434,19 +27899,8 @@
                 <w:sz w:val="32"/>
                 <w:szCs w:val="40"/>
               </w:rPr>
-              <w:t>)</w:t>
-            </w:r>
-            <w:proofErr w:type="gramStart"/>
-            <w:r>
-              <w:rPr>
-                <w:rFonts w:ascii="BRH Malayalam Extra" w:hAnsi="BRH Malayalam Extra" w:cs="BRH Malayalam Extra"/>
-                <w:color w:val="000000"/>
-                <w:sz w:val="32"/>
-                <w:szCs w:val="40"/>
-              </w:rPr>
-              <w:t>-  s</w:t>
-            </w:r>
-            <w:proofErr w:type="gramEnd"/>
+              <w:t>)-  s</w:t>
+            </w:r>
             <w:r>
               <w:rPr>
                 <w:rFonts w:ascii="BRH Malayalam Extra" w:hAnsi="BRH Malayalam Extra" w:cs="BRH Malayalam Extra"/>
@@ -28959,17 +28413,7 @@
                 <w:sz w:val="32"/>
                 <w:szCs w:val="40"/>
               </w:rPr>
-              <w:t>)</w:t>
-            </w:r>
-            <w:proofErr w:type="gramStart"/>
-            <w:r>
-              <w:rPr>
-                <w:rFonts w:ascii="BRH Malayalam Extra" w:hAnsi="BRH Malayalam Extra" w:cs="BRH Malayalam Extra"/>
-                <w:color w:val="000000"/>
-                <w:sz w:val="32"/>
-                <w:szCs w:val="40"/>
-              </w:rPr>
-              <w:t xml:space="preserve">-  </w:t>
+              <w:t xml:space="preserve">)-  </w:t>
             </w:r>
             <w:r>
               <w:rPr>
@@ -28979,18 +28423,7 @@
                 <w:szCs w:val="40"/>
                 <w:highlight w:val="green"/>
               </w:rPr>
-              <w:t>K</w:t>
-            </w:r>
-            <w:proofErr w:type="gramEnd"/>
-            <w:r>
-              <w:rPr>
-                <w:rFonts w:ascii="BRH Malayalam Extra" w:hAnsi="BRH Malayalam Extra" w:cs="BRH Malayalam Extra"/>
-                <w:color w:val="000000"/>
-                <w:sz w:val="32"/>
-                <w:szCs w:val="40"/>
-                <w:highlight w:val="green"/>
-              </w:rPr>
-              <w:t>¡</w:t>
+              <w:t>K¡</w:t>
             </w:r>
             <w:r>
               <w:rPr>
@@ -29768,19 +29201,8 @@
                 <w:sz w:val="32"/>
                 <w:szCs w:val="40"/>
               </w:rPr>
-              <w:t>)</w:t>
-            </w:r>
-            <w:proofErr w:type="gramStart"/>
-            <w:r>
-              <w:rPr>
-                <w:rFonts w:ascii="BRH Malayalam Extra" w:hAnsi="BRH Malayalam Extra" w:cs="BRH Malayalam Extra"/>
-                <w:color w:val="000000"/>
-                <w:sz w:val="32"/>
-                <w:szCs w:val="40"/>
-              </w:rPr>
-              <w:t>-  s</w:t>
-            </w:r>
-            <w:proofErr w:type="gramEnd"/>
+              <w:t>)-  s</w:t>
+            </w:r>
             <w:r>
               <w:rPr>
                 <w:rFonts w:ascii="BRH Malayalam Extra" w:hAnsi="BRH Malayalam Extra" w:cs="BRH Malayalam Extra"/>
@@ -30021,19 +29443,8 @@
                 <w:sz w:val="32"/>
                 <w:szCs w:val="40"/>
               </w:rPr>
-              <w:t>)</w:t>
-            </w:r>
-            <w:proofErr w:type="gramStart"/>
-            <w:r>
-              <w:rPr>
-                <w:rFonts w:ascii="BRH Malayalam Extra" w:hAnsi="BRH Malayalam Extra" w:cs="BRH Malayalam Extra"/>
-                <w:color w:val="000000"/>
-                <w:sz w:val="32"/>
-                <w:szCs w:val="40"/>
-              </w:rPr>
-              <w:t>-  s</w:t>
-            </w:r>
-            <w:proofErr w:type="gramEnd"/>
+              <w:t>)-  s</w:t>
+            </w:r>
             <w:r>
               <w:rPr>
                 <w:rFonts w:ascii="BRH Malayalam Extra" w:hAnsi="BRH Malayalam Extra" w:cs="BRH Malayalam Extra"/>
@@ -30525,19 +29936,8 @@
                 <w:sz w:val="32"/>
                 <w:szCs w:val="40"/>
               </w:rPr>
-              <w:t>)</w:t>
-            </w:r>
-            <w:proofErr w:type="gramStart"/>
-            <w:r>
-              <w:rPr>
-                <w:rFonts w:ascii="BRH Malayalam Extra" w:hAnsi="BRH Malayalam Extra" w:cs="BRH Malayalam Extra"/>
-                <w:color w:val="000000"/>
-                <w:sz w:val="32"/>
-                <w:szCs w:val="40"/>
-              </w:rPr>
-              <w:t>-  s</w:t>
-            </w:r>
-            <w:proofErr w:type="gramEnd"/>
+              <w:t>)-  s</w:t>
+            </w:r>
             <w:r>
               <w:rPr>
                 <w:rFonts w:ascii="BRH Malayalam Extra" w:hAnsi="BRH Malayalam Extra" w:cs="BRH Malayalam Extra"/>
@@ -30774,27 +30174,7 @@
                 <w:sz w:val="32"/>
                 <w:szCs w:val="40"/>
               </w:rPr>
-              <w:t>)</w:t>
-            </w:r>
-            <w:proofErr w:type="gramStart"/>
-            <w:r>
-              <w:rPr>
-                <w:rFonts w:ascii="BRH Malayalam Extra" w:hAnsi="BRH Malayalam Extra" w:cs="BRH Malayalam Extra"/>
-                <w:color w:val="000000"/>
-                <w:sz w:val="32"/>
-                <w:szCs w:val="40"/>
-              </w:rPr>
-              <w:t>-  Bsz</w:t>
-            </w:r>
-            <w:proofErr w:type="gramEnd"/>
-            <w:r>
-              <w:rPr>
-                <w:rFonts w:ascii="BRH Malayalam Extra" w:hAnsi="BRH Malayalam Extra" w:cs="BRH Malayalam Extra"/>
-                <w:color w:val="000000"/>
-                <w:sz w:val="32"/>
-                <w:szCs w:val="40"/>
-              </w:rPr>
-              <w:t>—dJ | q(³§)s—Zy | öe</w:t>
+              <w:t>)-  Bsz—dJ | q(³§)s—Zy | öe</w:t>
             </w:r>
             <w:r>
               <w:rPr>
@@ -30854,27 +30234,7 @@
                 <w:sz w:val="32"/>
                 <w:szCs w:val="40"/>
               </w:rPr>
-              <w:t>J q(³</w:t>
-            </w:r>
-            <w:proofErr w:type="gramStart"/>
-            <w:r>
-              <w:rPr>
-                <w:rFonts w:ascii="BRH Malayalam Extra" w:hAnsi="BRH Malayalam Extra" w:cs="BRH Malayalam Extra"/>
-                <w:color w:val="000000"/>
-                <w:sz w:val="32"/>
-                <w:szCs w:val="40"/>
-              </w:rPr>
-              <w:t>§)s</w:t>
-            </w:r>
-            <w:proofErr w:type="gramEnd"/>
-            <w:r>
-              <w:rPr>
-                <w:rFonts w:ascii="BRH Malayalam Extra" w:hAnsi="BRH Malayalam Extra" w:cs="BRH Malayalam Extra"/>
-                <w:color w:val="000000"/>
-                <w:sz w:val="32"/>
-                <w:szCs w:val="40"/>
-              </w:rPr>
-              <w:t>—Zy</w:t>
+              <w:t>J q(³§)s—Zy</w:t>
             </w:r>
             <w:r>
               <w:rPr>
@@ -31199,27 +30559,7 @@
                 <w:sz w:val="32"/>
                 <w:szCs w:val="40"/>
               </w:rPr>
-              <w:t>)</w:t>
-            </w:r>
-            <w:proofErr w:type="gramStart"/>
-            <w:r>
-              <w:rPr>
-                <w:rFonts w:ascii="BRH Malayalam Extra" w:hAnsi="BRH Malayalam Extra" w:cs="BRH Malayalam Extra"/>
-                <w:color w:val="000000"/>
-                <w:sz w:val="32"/>
-                <w:szCs w:val="40"/>
-              </w:rPr>
-              <w:t>-  q</w:t>
-            </w:r>
-            <w:proofErr w:type="gramEnd"/>
-            <w:r>
-              <w:rPr>
-                <w:rFonts w:ascii="BRH Malayalam Extra" w:hAnsi="BRH Malayalam Extra" w:cs="BRH Malayalam Extra"/>
-                <w:color w:val="000000"/>
-                <w:sz w:val="32"/>
-                <w:szCs w:val="40"/>
-              </w:rPr>
-              <w:t>(³§)s—Zy | öe</w:t>
+              <w:t>)-  q(³§)s—Zy | öe</w:t>
             </w:r>
             <w:r>
               <w:rPr>
@@ -31261,27 +30601,7 @@
                 <w:sz w:val="32"/>
                 <w:szCs w:val="40"/>
               </w:rPr>
-              <w:t>q(³</w:t>
-            </w:r>
-            <w:proofErr w:type="gramStart"/>
-            <w:r>
-              <w:rPr>
-                <w:rFonts w:ascii="BRH Malayalam Extra" w:hAnsi="BRH Malayalam Extra" w:cs="BRH Malayalam Extra"/>
-                <w:color w:val="000000"/>
-                <w:sz w:val="32"/>
-                <w:szCs w:val="40"/>
-              </w:rPr>
-              <w:t>§)s</w:t>
-            </w:r>
-            <w:proofErr w:type="gramEnd"/>
-            <w:r>
-              <w:rPr>
-                <w:rFonts w:ascii="BRH Malayalam Extra" w:hAnsi="BRH Malayalam Extra" w:cs="BRH Malayalam Extra"/>
-                <w:color w:val="000000"/>
-                <w:sz w:val="32"/>
-                <w:szCs w:val="40"/>
-              </w:rPr>
-              <w:t>—Zy öe</w:t>
+              <w:t>q(³§)s—Zy öe</w:t>
             </w:r>
             <w:r>
               <w:rPr>
@@ -31378,27 +30698,7 @@
                 <w:szCs w:val="40"/>
               </w:rPr>
               <w:lastRenderedPageBreak/>
-              <w:t>q(³</w:t>
-            </w:r>
-            <w:proofErr w:type="gramStart"/>
-            <w:r>
-              <w:rPr>
-                <w:rFonts w:ascii="BRH Malayalam Extra" w:hAnsi="BRH Malayalam Extra" w:cs="BRH Malayalam Extra"/>
-                <w:color w:val="000000"/>
-                <w:sz w:val="32"/>
-                <w:szCs w:val="40"/>
-              </w:rPr>
-              <w:t>§)s</w:t>
-            </w:r>
-            <w:proofErr w:type="gramEnd"/>
-            <w:r>
-              <w:rPr>
-                <w:rFonts w:ascii="BRH Malayalam Extra" w:hAnsi="BRH Malayalam Extra" w:cs="BRH Malayalam Extra"/>
-                <w:color w:val="000000"/>
-                <w:sz w:val="32"/>
-                <w:szCs w:val="40"/>
-              </w:rPr>
-              <w:t>—Zy öe</w:t>
+              <w:t>q(³§)s—Zy öe</w:t>
             </w:r>
             <w:r>
               <w:rPr>
@@ -31663,27 +30963,7 @@
                 <w:sz w:val="32"/>
                 <w:szCs w:val="40"/>
               </w:rPr>
-              <w:t>)</w:t>
-            </w:r>
-            <w:proofErr w:type="gramStart"/>
-            <w:r>
-              <w:rPr>
-                <w:rFonts w:ascii="BRH Malayalam Extra" w:hAnsi="BRH Malayalam Extra" w:cs="BRH Malayalam Extra"/>
-                <w:color w:val="000000"/>
-                <w:sz w:val="32"/>
-                <w:szCs w:val="40"/>
-              </w:rPr>
-              <w:t>-  Bsz</w:t>
-            </w:r>
-            <w:proofErr w:type="gramEnd"/>
-            <w:r>
-              <w:rPr>
-                <w:rFonts w:ascii="BRH Malayalam Extra" w:hAnsi="BRH Malayalam Extra" w:cs="BRH Malayalam Extra"/>
-                <w:color w:val="000000"/>
-                <w:sz w:val="32"/>
-                <w:szCs w:val="40"/>
-              </w:rPr>
-              <w:t>—dJ | q(³§)s—Zy | öe</w:t>
+              <w:t>)-  Bsz—dJ | q(³§)s—Zy | öe</w:t>
             </w:r>
             <w:r>
               <w:rPr>
@@ -31742,27 +31022,7 @@
                 <w:sz w:val="32"/>
                 <w:szCs w:val="40"/>
               </w:rPr>
-              <w:t>J q(³</w:t>
-            </w:r>
-            <w:proofErr w:type="gramStart"/>
-            <w:r>
-              <w:rPr>
-                <w:rFonts w:ascii="BRH Malayalam Extra" w:hAnsi="BRH Malayalam Extra" w:cs="BRH Malayalam Extra"/>
-                <w:color w:val="000000"/>
-                <w:sz w:val="32"/>
-                <w:szCs w:val="40"/>
-              </w:rPr>
-              <w:t>§)s</w:t>
-            </w:r>
-            <w:proofErr w:type="gramEnd"/>
-            <w:r>
-              <w:rPr>
-                <w:rFonts w:ascii="BRH Malayalam Extra" w:hAnsi="BRH Malayalam Extra" w:cs="BRH Malayalam Extra"/>
-                <w:color w:val="000000"/>
-                <w:sz w:val="32"/>
-                <w:szCs w:val="40"/>
-              </w:rPr>
-              <w:t>—Zy</w:t>
+              <w:t>J q(³§)s—Zy</w:t>
             </w:r>
             <w:r>
               <w:rPr>
@@ -32084,27 +31344,7 @@
                 <w:sz w:val="32"/>
                 <w:szCs w:val="40"/>
               </w:rPr>
-              <w:t>)</w:t>
-            </w:r>
-            <w:proofErr w:type="gramStart"/>
-            <w:r>
-              <w:rPr>
-                <w:rFonts w:ascii="BRH Malayalam Extra" w:hAnsi="BRH Malayalam Extra" w:cs="BRH Malayalam Extra"/>
-                <w:color w:val="000000"/>
-                <w:sz w:val="32"/>
-                <w:szCs w:val="40"/>
-              </w:rPr>
-              <w:t>-  q</w:t>
-            </w:r>
-            <w:proofErr w:type="gramEnd"/>
-            <w:r>
-              <w:rPr>
-                <w:rFonts w:ascii="BRH Malayalam Extra" w:hAnsi="BRH Malayalam Extra" w:cs="BRH Malayalam Extra"/>
-                <w:color w:val="000000"/>
-                <w:sz w:val="32"/>
-                <w:szCs w:val="40"/>
-              </w:rPr>
-              <w:t>(³§)s—Zy | öe</w:t>
+              <w:t>)-  q(³§)s—Zy | öe</w:t>
             </w:r>
             <w:r>
               <w:rPr>
@@ -32146,27 +31386,7 @@
                 <w:sz w:val="32"/>
                 <w:szCs w:val="40"/>
               </w:rPr>
-              <w:t>q(³</w:t>
-            </w:r>
-            <w:proofErr w:type="gramStart"/>
-            <w:r>
-              <w:rPr>
-                <w:rFonts w:ascii="BRH Malayalam Extra" w:hAnsi="BRH Malayalam Extra" w:cs="BRH Malayalam Extra"/>
-                <w:color w:val="000000"/>
-                <w:sz w:val="32"/>
-                <w:szCs w:val="40"/>
-              </w:rPr>
-              <w:t>§)s</w:t>
-            </w:r>
-            <w:proofErr w:type="gramEnd"/>
-            <w:r>
-              <w:rPr>
-                <w:rFonts w:ascii="BRH Malayalam Extra" w:hAnsi="BRH Malayalam Extra" w:cs="BRH Malayalam Extra"/>
-                <w:color w:val="000000"/>
-                <w:sz w:val="32"/>
-                <w:szCs w:val="40"/>
-              </w:rPr>
-              <w:t>—Zy öe</w:t>
+              <w:t>q(³§)s—Zy öe</w:t>
             </w:r>
             <w:r>
               <w:rPr>
@@ -32263,27 +31483,7 @@
                 <w:szCs w:val="40"/>
               </w:rPr>
               <w:lastRenderedPageBreak/>
-              <w:t>q(³</w:t>
-            </w:r>
-            <w:proofErr w:type="gramStart"/>
-            <w:r>
-              <w:rPr>
-                <w:rFonts w:ascii="BRH Malayalam Extra" w:hAnsi="BRH Malayalam Extra" w:cs="BRH Malayalam Extra"/>
-                <w:color w:val="000000"/>
-                <w:sz w:val="32"/>
-                <w:szCs w:val="40"/>
-              </w:rPr>
-              <w:t>§)s</w:t>
-            </w:r>
-            <w:proofErr w:type="gramEnd"/>
-            <w:r>
-              <w:rPr>
-                <w:rFonts w:ascii="BRH Malayalam Extra" w:hAnsi="BRH Malayalam Extra" w:cs="BRH Malayalam Extra"/>
-                <w:color w:val="000000"/>
-                <w:sz w:val="32"/>
-                <w:szCs w:val="40"/>
-              </w:rPr>
-              <w:t>—Zy öe</w:t>
+              <w:t>q(³§)s—Zy öe</w:t>
             </w:r>
             <w:r>
               <w:rPr>
@@ -32440,45 +31640,6 @@
         <w:lastRenderedPageBreak/>
         <w:t>===========</w:t>
       </w:r>
-    </w:p>
-    <w:p>
-      <w:pPr>
-        <w:spacing w:before="0" w:line="240" w:lineRule="auto"/>
-        <w:jc w:val="center"/>
-        <w:rPr>
-          <w:b/>
-          <w:bCs/>
-          <w:sz w:val="32"/>
-          <w:szCs w:val="32"/>
-          <w:u w:val="single"/>
-        </w:rPr>
-      </w:pPr>
-    </w:p>
-    <w:p>
-      <w:pPr>
-        <w:spacing w:before="0" w:line="240" w:lineRule="auto"/>
-        <w:jc w:val="center"/>
-        <w:rPr>
-          <w:b/>
-          <w:bCs/>
-          <w:sz w:val="32"/>
-          <w:szCs w:val="32"/>
-          <w:u w:val="single"/>
-        </w:rPr>
-      </w:pPr>
-    </w:p>
-    <w:p>
-      <w:pPr>
-        <w:spacing w:before="0" w:line="240" w:lineRule="auto"/>
-        <w:jc w:val="center"/>
-        <w:rPr>
-          <w:b/>
-          <w:bCs/>
-          <w:sz w:val="32"/>
-          <w:szCs w:val="32"/>
-          <w:u w:val="single"/>
-        </w:rPr>
-      </w:pPr>
     </w:p>
     <w:p>
       <w:pPr>
@@ -32961,7 +32122,7 @@
 </file>
 
 <file path=word/endnotes.xml><?xml version="1.0" encoding="utf-8"?>
-<w:endnotes xmlns:wpc="http://schemas.microsoft.com/office/word/2010/wordprocessingCanvas" xmlns:cx="http://schemas.microsoft.com/office/drawing/2014/chartex" xmlns:cx1="http://schemas.microsoft.com/office/drawing/2015/9/8/chartex" xmlns:cx2="http://schemas.microsoft.com/office/drawing/2015/10/21/chartex" xmlns:cx3="http://schemas.microsoft.com/office/drawing/2016/5/9/chartex" xmlns:cx4="http://schemas.microsoft.com/office/drawing/2016/5/10/chartex" xmlns:cx5="http://schemas.microsoft.com/office/drawing/2016/5/11/chartex" xmlns:cx6="http://schemas.microsoft.com/office/drawing/2016/5/12/chartex" xmlns:cx7="http://schemas.microsoft.com/office/drawing/2016/5/13/chartex" xmlns:cx8="http://schemas.microsoft.com/office/drawing/2016/5/14/chartex" xmlns:mc="http://schemas.openxmlformats.org/markup-compatibility/2006" xmlns:aink="http://schemas.microsoft.com/office/drawing/2016/ink" xmlns:am3d="http://schemas.microsoft.com/office/drawing/2017/model3d" xmlns:o="urn:schemas-microsoft-com:office:office" xmlns:oel="http://schemas.microsoft.com/office/2019/extlst" xmlns:r="http://schemas.openxmlformats.org/officeDocument/2006/relationships" xmlns:m="http://schemas.openxmlformats.org/officeDocument/2006/math" xmlns:v="urn:schemas-microsoft-com:vml" xmlns:wp14="http://schemas.microsoft.com/office/word/2010/wordprocessingDrawing" xmlns:wp="http://schemas.openxmlformats.org/drawingml/2006/wordprocessingDrawing" xmlns:w10="urn:schemas-microsoft-com:office:word" xmlns:w="http://schemas.openxmlformats.org/wordprocessingml/2006/main" xmlns:w14="http://schemas.microsoft.com/office/word/2010/wordml" xmlns:w15="http://schemas.microsoft.com/office/word/2012/wordml" xmlns:w16cex="http://schemas.microsoft.com/office/word/2018/wordml/cex" xmlns:w16cid="http://schemas.microsoft.com/office/word/2016/wordml/cid" xmlns:w16="http://schemas.microsoft.com/office/word/2018/wordml" xmlns:w16sdtdh="http://schemas.microsoft.com/office/word/2020/wordml/sdtdatahash" xmlns:w16se="http://schemas.microsoft.com/office/word/2015/wordml/symex" xmlns:wpg="http://schemas.microsoft.com/office/word/2010/wordprocessingGroup" xmlns:wpi="http://schemas.microsoft.com/office/word/2010/wordprocessingInk" xmlns:wne="http://schemas.microsoft.com/office/word/2006/wordml" xmlns:wps="http://schemas.microsoft.com/office/word/2010/wordprocessingShape" mc:Ignorable="w14 w15 w16se w16cid w16 w16cex w16sdtdh wp14">
+<w:endnotes xmlns:wpc="http://schemas.microsoft.com/office/word/2010/wordprocessingCanvas" xmlns:cx="http://schemas.microsoft.com/office/drawing/2014/chartex" xmlns:cx1="http://schemas.microsoft.com/office/drawing/2015/9/8/chartex" xmlns:cx2="http://schemas.microsoft.com/office/drawing/2015/10/21/chartex" xmlns:cx3="http://schemas.microsoft.com/office/drawing/2016/5/9/chartex" xmlns:cx4="http://schemas.microsoft.com/office/drawing/2016/5/10/chartex" xmlns:cx5="http://schemas.microsoft.com/office/drawing/2016/5/11/chartex" xmlns:cx6="http://schemas.microsoft.com/office/drawing/2016/5/12/chartex" xmlns:cx7="http://schemas.microsoft.com/office/drawing/2016/5/13/chartex" xmlns:cx8="http://schemas.microsoft.com/office/drawing/2016/5/14/chartex" xmlns:mc="http://schemas.openxmlformats.org/markup-compatibility/2006" xmlns:aink="http://schemas.microsoft.com/office/drawing/2016/ink" xmlns:am3d="http://schemas.microsoft.com/office/drawing/2017/model3d" xmlns:o="urn:schemas-microsoft-com:office:office" xmlns:oel="http://schemas.microsoft.com/office/2019/extlst" xmlns:r="http://schemas.openxmlformats.org/officeDocument/2006/relationships" xmlns:m="http://schemas.openxmlformats.org/officeDocument/2006/math" xmlns:v="urn:schemas-microsoft-com:vml" xmlns:wp14="http://schemas.microsoft.com/office/word/2010/wordprocessingDrawing" xmlns:wp="http://schemas.openxmlformats.org/drawingml/2006/wordprocessingDrawing" xmlns:w10="urn:schemas-microsoft-com:office:word" xmlns:w="http://schemas.openxmlformats.org/wordprocessingml/2006/main" xmlns:w14="http://schemas.microsoft.com/office/word/2010/wordml" xmlns:w15="http://schemas.microsoft.com/office/word/2012/wordml" xmlns:w16cex="http://schemas.microsoft.com/office/word/2018/wordml/cex" xmlns:w16cid="http://schemas.microsoft.com/office/word/2016/wordml/cid" xmlns:w16="http://schemas.microsoft.com/office/word/2018/wordml" xmlns:w16du="http://schemas.microsoft.com/office/word/2023/wordml/word16du" xmlns:w16sdtdh="http://schemas.microsoft.com/office/word/2020/wordml/sdtdatahash" xmlns:w16sdtfl="http://schemas.microsoft.com/office/word/2024/wordml/sdtformatlock" xmlns:w16se="http://schemas.microsoft.com/office/word/2015/wordml/symex" xmlns:wpg="http://schemas.microsoft.com/office/word/2010/wordprocessingGroup" xmlns:wpi="http://schemas.microsoft.com/office/word/2010/wordprocessingInk" xmlns:wne="http://schemas.microsoft.com/office/word/2006/wordml" xmlns:wps="http://schemas.microsoft.com/office/word/2010/wordprocessingShape" mc:Ignorable="w14 w15 w16se w16cid w16 w16cex w16sdtdh w16sdtfl w16du wp14">
   <w:endnote w:type="separator" w:id="-1">
     <w:p>
       <w:pPr>
@@ -32986,7 +32147,7 @@
 </file>
 
 <file path=word/footer1.xml><?xml version="1.0" encoding="utf-8"?>
-<w:ftr xmlns:wpc="http://schemas.microsoft.com/office/word/2010/wordprocessingCanvas" xmlns:cx="http://schemas.microsoft.com/office/drawing/2014/chartex" xmlns:cx1="http://schemas.microsoft.com/office/drawing/2015/9/8/chartex" xmlns:cx2="http://schemas.microsoft.com/office/drawing/2015/10/21/chartex" xmlns:cx3="http://schemas.microsoft.com/office/drawing/2016/5/9/chartex" xmlns:cx4="http://schemas.microsoft.com/office/drawing/2016/5/10/chartex" xmlns:cx5="http://schemas.microsoft.com/office/drawing/2016/5/11/chartex" xmlns:cx6="http://schemas.microsoft.com/office/drawing/2016/5/12/chartex" xmlns:cx7="http://schemas.microsoft.com/office/drawing/2016/5/13/chartex" xmlns:cx8="http://schemas.microsoft.com/office/drawing/2016/5/14/chartex" xmlns:mc="http://schemas.openxmlformats.org/markup-compatibility/2006" xmlns:aink="http://schemas.microsoft.com/office/drawing/2016/ink" xmlns:am3d="http://schemas.microsoft.com/office/drawing/2017/model3d" xmlns:o="urn:schemas-microsoft-com:office:office" xmlns:oel="http://schemas.microsoft.com/office/2019/extlst" xmlns:r="http://schemas.openxmlformats.org/officeDocument/2006/relationships" xmlns:m="http://schemas.openxmlformats.org/officeDocument/2006/math" xmlns:v="urn:schemas-microsoft-com:vml" xmlns:wp14="http://schemas.microsoft.com/office/word/2010/wordprocessingDrawing" xmlns:wp="http://schemas.openxmlformats.org/drawingml/2006/wordprocessingDrawing" xmlns:w10="urn:schemas-microsoft-com:office:word" xmlns:w="http://schemas.openxmlformats.org/wordprocessingml/2006/main" xmlns:w14="http://schemas.microsoft.com/office/word/2010/wordml" xmlns:w15="http://schemas.microsoft.com/office/word/2012/wordml" xmlns:w16cex="http://schemas.microsoft.com/office/word/2018/wordml/cex" xmlns:w16cid="http://schemas.microsoft.com/office/word/2016/wordml/cid" xmlns:w16="http://schemas.microsoft.com/office/word/2018/wordml" xmlns:w16sdtdh="http://schemas.microsoft.com/office/word/2020/wordml/sdtdatahash" xmlns:w16se="http://schemas.microsoft.com/office/word/2015/wordml/symex" xmlns:wpg="http://schemas.microsoft.com/office/word/2010/wordprocessingGroup" xmlns:wpi="http://schemas.microsoft.com/office/word/2010/wordprocessingInk" xmlns:wne="http://schemas.microsoft.com/office/word/2006/wordml" xmlns:wps="http://schemas.microsoft.com/office/word/2010/wordprocessingShape" mc:Ignorable="w14 w15 w16se w16cid w16 w16cex w16sdtdh wp14">
+<w:ftr xmlns:wpc="http://schemas.microsoft.com/office/word/2010/wordprocessingCanvas" xmlns:cx="http://schemas.microsoft.com/office/drawing/2014/chartex" xmlns:cx1="http://schemas.microsoft.com/office/drawing/2015/9/8/chartex" xmlns:cx2="http://schemas.microsoft.com/office/drawing/2015/10/21/chartex" xmlns:cx3="http://schemas.microsoft.com/office/drawing/2016/5/9/chartex" xmlns:cx4="http://schemas.microsoft.com/office/drawing/2016/5/10/chartex" xmlns:cx5="http://schemas.microsoft.com/office/drawing/2016/5/11/chartex" xmlns:cx6="http://schemas.microsoft.com/office/drawing/2016/5/12/chartex" xmlns:cx7="http://schemas.microsoft.com/office/drawing/2016/5/13/chartex" xmlns:cx8="http://schemas.microsoft.com/office/drawing/2016/5/14/chartex" xmlns:mc="http://schemas.openxmlformats.org/markup-compatibility/2006" xmlns:aink="http://schemas.microsoft.com/office/drawing/2016/ink" xmlns:am3d="http://schemas.microsoft.com/office/drawing/2017/model3d" xmlns:o="urn:schemas-microsoft-com:office:office" xmlns:oel="http://schemas.microsoft.com/office/2019/extlst" xmlns:r="http://schemas.openxmlformats.org/officeDocument/2006/relationships" xmlns:m="http://schemas.openxmlformats.org/officeDocument/2006/math" xmlns:v="urn:schemas-microsoft-com:vml" xmlns:wp14="http://schemas.microsoft.com/office/word/2010/wordprocessingDrawing" xmlns:wp="http://schemas.openxmlformats.org/drawingml/2006/wordprocessingDrawing" xmlns:w10="urn:schemas-microsoft-com:office:word" xmlns:w="http://schemas.openxmlformats.org/wordprocessingml/2006/main" xmlns:w14="http://schemas.microsoft.com/office/word/2010/wordml" xmlns:w15="http://schemas.microsoft.com/office/word/2012/wordml" xmlns:w16cex="http://schemas.microsoft.com/office/word/2018/wordml/cex" xmlns:w16cid="http://schemas.microsoft.com/office/word/2016/wordml/cid" xmlns:w16="http://schemas.microsoft.com/office/word/2018/wordml" xmlns:w16du="http://schemas.microsoft.com/office/word/2023/wordml/word16du" xmlns:w16sdtdh="http://schemas.microsoft.com/office/word/2020/wordml/sdtdatahash" xmlns:w16sdtfl="http://schemas.microsoft.com/office/word/2024/wordml/sdtformatlock" xmlns:w16se="http://schemas.microsoft.com/office/word/2015/wordml/symex" xmlns:wpg="http://schemas.microsoft.com/office/word/2010/wordprocessingGroup" xmlns:wpi="http://schemas.microsoft.com/office/word/2010/wordprocessingInk" xmlns:wne="http://schemas.microsoft.com/office/word/2006/wordml" xmlns:wps="http://schemas.microsoft.com/office/word/2010/wordprocessingShape" mc:Ignorable="w14 w15 w16se w16cid w16 w16cex w16sdtdh w16sdtfl w16du wp14">
   <w:p>
     <w:pPr>
       <w:pBdr>
@@ -33168,7 +32329,7 @@
 </file>
 
 <file path=word/footer2.xml><?xml version="1.0" encoding="utf-8"?>
-<w:ftr xmlns:wpc="http://schemas.microsoft.com/office/word/2010/wordprocessingCanvas" xmlns:cx="http://schemas.microsoft.com/office/drawing/2014/chartex" xmlns:cx1="http://schemas.microsoft.com/office/drawing/2015/9/8/chartex" xmlns:cx2="http://schemas.microsoft.com/office/drawing/2015/10/21/chartex" xmlns:cx3="http://schemas.microsoft.com/office/drawing/2016/5/9/chartex" xmlns:cx4="http://schemas.microsoft.com/office/drawing/2016/5/10/chartex" xmlns:cx5="http://schemas.microsoft.com/office/drawing/2016/5/11/chartex" xmlns:cx6="http://schemas.microsoft.com/office/drawing/2016/5/12/chartex" xmlns:cx7="http://schemas.microsoft.com/office/drawing/2016/5/13/chartex" xmlns:cx8="http://schemas.microsoft.com/office/drawing/2016/5/14/chartex" xmlns:mc="http://schemas.openxmlformats.org/markup-compatibility/2006" xmlns:aink="http://schemas.microsoft.com/office/drawing/2016/ink" xmlns:am3d="http://schemas.microsoft.com/office/drawing/2017/model3d" xmlns:o="urn:schemas-microsoft-com:office:office" xmlns:oel="http://schemas.microsoft.com/office/2019/extlst" xmlns:r="http://schemas.openxmlformats.org/officeDocument/2006/relationships" xmlns:m="http://schemas.openxmlformats.org/officeDocument/2006/math" xmlns:v="urn:schemas-microsoft-com:vml" xmlns:wp14="http://schemas.microsoft.com/office/word/2010/wordprocessingDrawing" xmlns:wp="http://schemas.openxmlformats.org/drawingml/2006/wordprocessingDrawing" xmlns:w10="urn:schemas-microsoft-com:office:word" xmlns:w="http://schemas.openxmlformats.org/wordprocessingml/2006/main" xmlns:w14="http://schemas.microsoft.com/office/word/2010/wordml" xmlns:w15="http://schemas.microsoft.com/office/word/2012/wordml" xmlns:w16cex="http://schemas.microsoft.com/office/word/2018/wordml/cex" xmlns:w16cid="http://schemas.microsoft.com/office/word/2016/wordml/cid" xmlns:w16="http://schemas.microsoft.com/office/word/2018/wordml" xmlns:w16sdtdh="http://schemas.microsoft.com/office/word/2020/wordml/sdtdatahash" xmlns:w16se="http://schemas.microsoft.com/office/word/2015/wordml/symex" xmlns:wpg="http://schemas.microsoft.com/office/word/2010/wordprocessingGroup" xmlns:wpi="http://schemas.microsoft.com/office/word/2010/wordprocessingInk" xmlns:wne="http://schemas.microsoft.com/office/word/2006/wordml" xmlns:wps="http://schemas.microsoft.com/office/word/2010/wordprocessingShape" mc:Ignorable="w14 w15 w16se w16cid w16 w16cex w16sdtdh wp14">
+<w:ftr xmlns:wpc="http://schemas.microsoft.com/office/word/2010/wordprocessingCanvas" xmlns:cx="http://schemas.microsoft.com/office/drawing/2014/chartex" xmlns:cx1="http://schemas.microsoft.com/office/drawing/2015/9/8/chartex" xmlns:cx2="http://schemas.microsoft.com/office/drawing/2015/10/21/chartex" xmlns:cx3="http://schemas.microsoft.com/office/drawing/2016/5/9/chartex" xmlns:cx4="http://schemas.microsoft.com/office/drawing/2016/5/10/chartex" xmlns:cx5="http://schemas.microsoft.com/office/drawing/2016/5/11/chartex" xmlns:cx6="http://schemas.microsoft.com/office/drawing/2016/5/12/chartex" xmlns:cx7="http://schemas.microsoft.com/office/drawing/2016/5/13/chartex" xmlns:cx8="http://schemas.microsoft.com/office/drawing/2016/5/14/chartex" xmlns:mc="http://schemas.openxmlformats.org/markup-compatibility/2006" xmlns:aink="http://schemas.microsoft.com/office/drawing/2016/ink" xmlns:am3d="http://schemas.microsoft.com/office/drawing/2017/model3d" xmlns:o="urn:schemas-microsoft-com:office:office" xmlns:oel="http://schemas.microsoft.com/office/2019/extlst" xmlns:r="http://schemas.openxmlformats.org/officeDocument/2006/relationships" xmlns:m="http://schemas.openxmlformats.org/officeDocument/2006/math" xmlns:v="urn:schemas-microsoft-com:vml" xmlns:wp14="http://schemas.microsoft.com/office/word/2010/wordprocessingDrawing" xmlns:wp="http://schemas.openxmlformats.org/drawingml/2006/wordprocessingDrawing" xmlns:w10="urn:schemas-microsoft-com:office:word" xmlns:w="http://schemas.openxmlformats.org/wordprocessingml/2006/main" xmlns:w14="http://schemas.microsoft.com/office/word/2010/wordml" xmlns:w15="http://schemas.microsoft.com/office/word/2012/wordml" xmlns:w16cex="http://schemas.microsoft.com/office/word/2018/wordml/cex" xmlns:w16cid="http://schemas.microsoft.com/office/word/2016/wordml/cid" xmlns:w16="http://schemas.microsoft.com/office/word/2018/wordml" xmlns:w16du="http://schemas.microsoft.com/office/word/2023/wordml/word16du" xmlns:w16sdtdh="http://schemas.microsoft.com/office/word/2020/wordml/sdtdatahash" xmlns:w16sdtfl="http://schemas.microsoft.com/office/word/2024/wordml/sdtformatlock" xmlns:w16se="http://schemas.microsoft.com/office/word/2015/wordml/symex" xmlns:wpg="http://schemas.microsoft.com/office/word/2010/wordprocessingGroup" xmlns:wpi="http://schemas.microsoft.com/office/word/2010/wordprocessingInk" xmlns:wne="http://schemas.microsoft.com/office/word/2006/wordml" xmlns:wps="http://schemas.microsoft.com/office/word/2010/wordprocessingShape" mc:Ignorable="w14 w15 w16se w16cid w16 w16cex w16sdtdh w16sdtfl w16du wp14">
   <w:p>
     <w:pPr>
       <w:pBdr>
@@ -33374,7 +32535,7 @@
 </file>
 
 <file path=word/footnotes.xml><?xml version="1.0" encoding="utf-8"?>
-<w:footnotes xmlns:wpc="http://schemas.microsoft.com/office/word/2010/wordprocessingCanvas" xmlns:cx="http://schemas.microsoft.com/office/drawing/2014/chartex" xmlns:cx1="http://schemas.microsoft.com/office/drawing/2015/9/8/chartex" xmlns:cx2="http://schemas.microsoft.com/office/drawing/2015/10/21/chartex" xmlns:cx3="http://schemas.microsoft.com/office/drawing/2016/5/9/chartex" xmlns:cx4="http://schemas.microsoft.com/office/drawing/2016/5/10/chartex" xmlns:cx5="http://schemas.microsoft.com/office/drawing/2016/5/11/chartex" xmlns:cx6="http://schemas.microsoft.com/office/drawing/2016/5/12/chartex" xmlns:cx7="http://schemas.microsoft.com/office/drawing/2016/5/13/chartex" xmlns:cx8="http://schemas.microsoft.com/office/drawing/2016/5/14/chartex" xmlns:mc="http://schemas.openxmlformats.org/markup-compatibility/2006" xmlns:aink="http://schemas.microsoft.com/office/drawing/2016/ink" xmlns:am3d="http://schemas.microsoft.com/office/drawing/2017/model3d" xmlns:o="urn:schemas-microsoft-com:office:office" xmlns:oel="http://schemas.microsoft.com/office/2019/extlst" xmlns:r="http://schemas.openxmlformats.org/officeDocument/2006/relationships" xmlns:m="http://schemas.openxmlformats.org/officeDocument/2006/math" xmlns:v="urn:schemas-microsoft-com:vml" xmlns:wp14="http://schemas.microsoft.com/office/word/2010/wordprocessingDrawing" xmlns:wp="http://schemas.openxmlformats.org/drawingml/2006/wordprocessingDrawing" xmlns:w10="urn:schemas-microsoft-com:office:word" xmlns:w="http://schemas.openxmlformats.org/wordprocessingml/2006/main" xmlns:w14="http://schemas.microsoft.com/office/word/2010/wordml" xmlns:w15="http://schemas.microsoft.com/office/word/2012/wordml" xmlns:w16cex="http://schemas.microsoft.com/office/word/2018/wordml/cex" xmlns:w16cid="http://schemas.microsoft.com/office/word/2016/wordml/cid" xmlns:w16="http://schemas.microsoft.com/office/word/2018/wordml" xmlns:w16sdtdh="http://schemas.microsoft.com/office/word/2020/wordml/sdtdatahash" xmlns:w16se="http://schemas.microsoft.com/office/word/2015/wordml/symex" xmlns:wpg="http://schemas.microsoft.com/office/word/2010/wordprocessingGroup" xmlns:wpi="http://schemas.microsoft.com/office/word/2010/wordprocessingInk" xmlns:wne="http://schemas.microsoft.com/office/word/2006/wordml" xmlns:wps="http://schemas.microsoft.com/office/word/2010/wordprocessingShape" mc:Ignorable="w14 w15 w16se w16cid w16 w16cex w16sdtdh wp14">
+<w:footnotes xmlns:wpc="http://schemas.microsoft.com/office/word/2010/wordprocessingCanvas" xmlns:cx="http://schemas.microsoft.com/office/drawing/2014/chartex" xmlns:cx1="http://schemas.microsoft.com/office/drawing/2015/9/8/chartex" xmlns:cx2="http://schemas.microsoft.com/office/drawing/2015/10/21/chartex" xmlns:cx3="http://schemas.microsoft.com/office/drawing/2016/5/9/chartex" xmlns:cx4="http://schemas.microsoft.com/office/drawing/2016/5/10/chartex" xmlns:cx5="http://schemas.microsoft.com/office/drawing/2016/5/11/chartex" xmlns:cx6="http://schemas.microsoft.com/office/drawing/2016/5/12/chartex" xmlns:cx7="http://schemas.microsoft.com/office/drawing/2016/5/13/chartex" xmlns:cx8="http://schemas.microsoft.com/office/drawing/2016/5/14/chartex" xmlns:mc="http://schemas.openxmlformats.org/markup-compatibility/2006" xmlns:aink="http://schemas.microsoft.com/office/drawing/2016/ink" xmlns:am3d="http://schemas.microsoft.com/office/drawing/2017/model3d" xmlns:o="urn:schemas-microsoft-com:office:office" xmlns:oel="http://schemas.microsoft.com/office/2019/extlst" xmlns:r="http://schemas.openxmlformats.org/officeDocument/2006/relationships" xmlns:m="http://schemas.openxmlformats.org/officeDocument/2006/math" xmlns:v="urn:schemas-microsoft-com:vml" xmlns:wp14="http://schemas.microsoft.com/office/word/2010/wordprocessingDrawing" xmlns:wp="http://schemas.openxmlformats.org/drawingml/2006/wordprocessingDrawing" xmlns:w10="urn:schemas-microsoft-com:office:word" xmlns:w="http://schemas.openxmlformats.org/wordprocessingml/2006/main" xmlns:w14="http://schemas.microsoft.com/office/word/2010/wordml" xmlns:w15="http://schemas.microsoft.com/office/word/2012/wordml" xmlns:w16cex="http://schemas.microsoft.com/office/word/2018/wordml/cex" xmlns:w16cid="http://schemas.microsoft.com/office/word/2016/wordml/cid" xmlns:w16="http://schemas.microsoft.com/office/word/2018/wordml" xmlns:w16du="http://schemas.microsoft.com/office/word/2023/wordml/word16du" xmlns:w16sdtdh="http://schemas.microsoft.com/office/word/2020/wordml/sdtdatahash" xmlns:w16sdtfl="http://schemas.microsoft.com/office/word/2024/wordml/sdtformatlock" xmlns:w16se="http://schemas.microsoft.com/office/word/2015/wordml/symex" xmlns:wpg="http://schemas.microsoft.com/office/word/2010/wordprocessingGroup" xmlns:wpi="http://schemas.microsoft.com/office/word/2010/wordprocessingInk" xmlns:wne="http://schemas.microsoft.com/office/word/2006/wordml" xmlns:wps="http://schemas.microsoft.com/office/word/2010/wordprocessingShape" mc:Ignorable="w14 w15 w16se w16cid w16 w16cex w16sdtdh w16sdtfl w16du wp14">
   <w:footnote w:type="separator" w:id="-1">
     <w:p>
       <w:pPr>
@@ -33399,7 +32560,7 @@
 </file>
 
 <file path=word/header1.xml><?xml version="1.0" encoding="utf-8"?>
-<w:hdr xmlns:wpc="http://schemas.microsoft.com/office/word/2010/wordprocessingCanvas" xmlns:cx="http://schemas.microsoft.com/office/drawing/2014/chartex" xmlns:cx1="http://schemas.microsoft.com/office/drawing/2015/9/8/chartex" xmlns:cx2="http://schemas.microsoft.com/office/drawing/2015/10/21/chartex" xmlns:cx3="http://schemas.microsoft.com/office/drawing/2016/5/9/chartex" xmlns:cx4="http://schemas.microsoft.com/office/drawing/2016/5/10/chartex" xmlns:cx5="http://schemas.microsoft.com/office/drawing/2016/5/11/chartex" xmlns:cx6="http://schemas.microsoft.com/office/drawing/2016/5/12/chartex" xmlns:cx7="http://schemas.microsoft.com/office/drawing/2016/5/13/chartex" xmlns:cx8="http://schemas.microsoft.com/office/drawing/2016/5/14/chartex" xmlns:mc="http://schemas.openxmlformats.org/markup-compatibility/2006" xmlns:aink="http://schemas.microsoft.com/office/drawing/2016/ink" xmlns:am3d="http://schemas.microsoft.com/office/drawing/2017/model3d" xmlns:o="urn:schemas-microsoft-com:office:office" xmlns:oel="http://schemas.microsoft.com/office/2019/extlst" xmlns:r="http://schemas.openxmlformats.org/officeDocument/2006/relationships" xmlns:m="http://schemas.openxmlformats.org/officeDocument/2006/math" xmlns:v="urn:schemas-microsoft-com:vml" xmlns:wp14="http://schemas.microsoft.com/office/word/2010/wordprocessingDrawing" xmlns:wp="http://schemas.openxmlformats.org/drawingml/2006/wordprocessingDrawing" xmlns:w10="urn:schemas-microsoft-com:office:word" xmlns:w="http://schemas.openxmlformats.org/wordprocessingml/2006/main" xmlns:w14="http://schemas.microsoft.com/office/word/2010/wordml" xmlns:w15="http://schemas.microsoft.com/office/word/2012/wordml" xmlns:w16cex="http://schemas.microsoft.com/office/word/2018/wordml/cex" xmlns:w16cid="http://schemas.microsoft.com/office/word/2016/wordml/cid" xmlns:w16="http://schemas.microsoft.com/office/word/2018/wordml" xmlns:w16sdtdh="http://schemas.microsoft.com/office/word/2020/wordml/sdtdatahash" xmlns:w16se="http://schemas.microsoft.com/office/word/2015/wordml/symex" xmlns:wpg="http://schemas.microsoft.com/office/word/2010/wordprocessingGroup" xmlns:wpi="http://schemas.microsoft.com/office/word/2010/wordprocessingInk" xmlns:wne="http://schemas.microsoft.com/office/word/2006/wordml" xmlns:wps="http://schemas.microsoft.com/office/word/2010/wordprocessingShape" mc:Ignorable="w14 w15 w16se w16cid w16 w16cex w16sdtdh wp14">
+<w:hdr xmlns:wpc="http://schemas.microsoft.com/office/word/2010/wordprocessingCanvas" xmlns:cx="http://schemas.microsoft.com/office/drawing/2014/chartex" xmlns:cx1="http://schemas.microsoft.com/office/drawing/2015/9/8/chartex" xmlns:cx2="http://schemas.microsoft.com/office/drawing/2015/10/21/chartex" xmlns:cx3="http://schemas.microsoft.com/office/drawing/2016/5/9/chartex" xmlns:cx4="http://schemas.microsoft.com/office/drawing/2016/5/10/chartex" xmlns:cx5="http://schemas.microsoft.com/office/drawing/2016/5/11/chartex" xmlns:cx6="http://schemas.microsoft.com/office/drawing/2016/5/12/chartex" xmlns:cx7="http://schemas.microsoft.com/office/drawing/2016/5/13/chartex" xmlns:cx8="http://schemas.microsoft.com/office/drawing/2016/5/14/chartex" xmlns:mc="http://schemas.openxmlformats.org/markup-compatibility/2006" xmlns:aink="http://schemas.microsoft.com/office/drawing/2016/ink" xmlns:am3d="http://schemas.microsoft.com/office/drawing/2017/model3d" xmlns:o="urn:schemas-microsoft-com:office:office" xmlns:oel="http://schemas.microsoft.com/office/2019/extlst" xmlns:r="http://schemas.openxmlformats.org/officeDocument/2006/relationships" xmlns:m="http://schemas.openxmlformats.org/officeDocument/2006/math" xmlns:v="urn:schemas-microsoft-com:vml" xmlns:wp14="http://schemas.microsoft.com/office/word/2010/wordprocessingDrawing" xmlns:wp="http://schemas.openxmlformats.org/drawingml/2006/wordprocessingDrawing" xmlns:w10="urn:schemas-microsoft-com:office:word" xmlns:w="http://schemas.openxmlformats.org/wordprocessingml/2006/main" xmlns:w14="http://schemas.microsoft.com/office/word/2010/wordml" xmlns:w15="http://schemas.microsoft.com/office/word/2012/wordml" xmlns:w16cex="http://schemas.microsoft.com/office/word/2018/wordml/cex" xmlns:w16cid="http://schemas.microsoft.com/office/word/2016/wordml/cid" xmlns:w16="http://schemas.microsoft.com/office/word/2018/wordml" xmlns:w16du="http://schemas.microsoft.com/office/word/2023/wordml/word16du" xmlns:w16sdtdh="http://schemas.microsoft.com/office/word/2020/wordml/sdtdatahash" xmlns:w16sdtfl="http://schemas.microsoft.com/office/word/2024/wordml/sdtformatlock" xmlns:w16se="http://schemas.microsoft.com/office/word/2015/wordml/symex" xmlns:wpg="http://schemas.microsoft.com/office/word/2010/wordprocessingGroup" xmlns:wpi="http://schemas.microsoft.com/office/word/2010/wordprocessingInk" xmlns:wne="http://schemas.microsoft.com/office/word/2006/wordml" xmlns:wps="http://schemas.microsoft.com/office/word/2010/wordprocessingShape" mc:Ignorable="w14 w15 w16se w16cid w16 w16cex w16sdtdh w16sdtfl w16du wp14">
   <w:p>
     <w:pPr>
       <w:pStyle w:val="Header"/>
@@ -33420,7 +32581,7 @@
 </file>
 
 <file path=word/header2.xml><?xml version="1.0" encoding="utf-8"?>
-<w:hdr xmlns:wpc="http://schemas.microsoft.com/office/word/2010/wordprocessingCanvas" xmlns:cx="http://schemas.microsoft.com/office/drawing/2014/chartex" xmlns:cx1="http://schemas.microsoft.com/office/drawing/2015/9/8/chartex" xmlns:cx2="http://schemas.microsoft.com/office/drawing/2015/10/21/chartex" xmlns:cx3="http://schemas.microsoft.com/office/drawing/2016/5/9/chartex" xmlns:cx4="http://schemas.microsoft.com/office/drawing/2016/5/10/chartex" xmlns:cx5="http://schemas.microsoft.com/office/drawing/2016/5/11/chartex" xmlns:cx6="http://schemas.microsoft.com/office/drawing/2016/5/12/chartex" xmlns:cx7="http://schemas.microsoft.com/office/drawing/2016/5/13/chartex" xmlns:cx8="http://schemas.microsoft.com/office/drawing/2016/5/14/chartex" xmlns:mc="http://schemas.openxmlformats.org/markup-compatibility/2006" xmlns:aink="http://schemas.microsoft.com/office/drawing/2016/ink" xmlns:am3d="http://schemas.microsoft.com/office/drawing/2017/model3d" xmlns:o="urn:schemas-microsoft-com:office:office" xmlns:oel="http://schemas.microsoft.com/office/2019/extlst" xmlns:r="http://schemas.openxmlformats.org/officeDocument/2006/relationships" xmlns:m="http://schemas.openxmlformats.org/officeDocument/2006/math" xmlns:v="urn:schemas-microsoft-com:vml" xmlns:wp14="http://schemas.microsoft.com/office/word/2010/wordprocessingDrawing" xmlns:wp="http://schemas.openxmlformats.org/drawingml/2006/wordprocessingDrawing" xmlns:w10="urn:schemas-microsoft-com:office:word" xmlns:w="http://schemas.openxmlformats.org/wordprocessingml/2006/main" xmlns:w14="http://schemas.microsoft.com/office/word/2010/wordml" xmlns:w15="http://schemas.microsoft.com/office/word/2012/wordml" xmlns:w16cex="http://schemas.microsoft.com/office/word/2018/wordml/cex" xmlns:w16cid="http://schemas.microsoft.com/office/word/2016/wordml/cid" xmlns:w16="http://schemas.microsoft.com/office/word/2018/wordml" xmlns:w16sdtdh="http://schemas.microsoft.com/office/word/2020/wordml/sdtdatahash" xmlns:w16se="http://schemas.microsoft.com/office/word/2015/wordml/symex" xmlns:wpg="http://schemas.microsoft.com/office/word/2010/wordprocessingGroup" xmlns:wpi="http://schemas.microsoft.com/office/word/2010/wordprocessingInk" xmlns:wne="http://schemas.microsoft.com/office/word/2006/wordml" xmlns:wps="http://schemas.microsoft.com/office/word/2010/wordprocessingShape" mc:Ignorable="w14 w15 w16se w16cid w16 w16cex w16sdtdh wp14">
+<w:hdr xmlns:wpc="http://schemas.microsoft.com/office/word/2010/wordprocessingCanvas" xmlns:cx="http://schemas.microsoft.com/office/drawing/2014/chartex" xmlns:cx1="http://schemas.microsoft.com/office/drawing/2015/9/8/chartex" xmlns:cx2="http://schemas.microsoft.com/office/drawing/2015/10/21/chartex" xmlns:cx3="http://schemas.microsoft.com/office/drawing/2016/5/9/chartex" xmlns:cx4="http://schemas.microsoft.com/office/drawing/2016/5/10/chartex" xmlns:cx5="http://schemas.microsoft.com/office/drawing/2016/5/11/chartex" xmlns:cx6="http://schemas.microsoft.com/office/drawing/2016/5/12/chartex" xmlns:cx7="http://schemas.microsoft.com/office/drawing/2016/5/13/chartex" xmlns:cx8="http://schemas.microsoft.com/office/drawing/2016/5/14/chartex" xmlns:mc="http://schemas.openxmlformats.org/markup-compatibility/2006" xmlns:aink="http://schemas.microsoft.com/office/drawing/2016/ink" xmlns:am3d="http://schemas.microsoft.com/office/drawing/2017/model3d" xmlns:o="urn:schemas-microsoft-com:office:office" xmlns:oel="http://schemas.microsoft.com/office/2019/extlst" xmlns:r="http://schemas.openxmlformats.org/officeDocument/2006/relationships" xmlns:m="http://schemas.openxmlformats.org/officeDocument/2006/math" xmlns:v="urn:schemas-microsoft-com:vml" xmlns:wp14="http://schemas.microsoft.com/office/word/2010/wordprocessingDrawing" xmlns:wp="http://schemas.openxmlformats.org/drawingml/2006/wordprocessingDrawing" xmlns:w10="urn:schemas-microsoft-com:office:word" xmlns:w="http://schemas.openxmlformats.org/wordprocessingml/2006/main" xmlns:w14="http://schemas.microsoft.com/office/word/2010/wordml" xmlns:w15="http://schemas.microsoft.com/office/word/2012/wordml" xmlns:w16cex="http://schemas.microsoft.com/office/word/2018/wordml/cex" xmlns:w16cid="http://schemas.microsoft.com/office/word/2016/wordml/cid" xmlns:w16="http://schemas.microsoft.com/office/word/2018/wordml" xmlns:w16du="http://schemas.microsoft.com/office/word/2023/wordml/word16du" xmlns:w16sdtdh="http://schemas.microsoft.com/office/word/2020/wordml/sdtdatahash" xmlns:w16sdtfl="http://schemas.microsoft.com/office/word/2024/wordml/sdtformatlock" xmlns:w16se="http://schemas.microsoft.com/office/word/2015/wordml/symex" xmlns:wpg="http://schemas.microsoft.com/office/word/2010/wordprocessingGroup" xmlns:wpi="http://schemas.microsoft.com/office/word/2010/wordprocessingInk" xmlns:wne="http://schemas.microsoft.com/office/word/2006/wordml" xmlns:wps="http://schemas.microsoft.com/office/word/2010/wordprocessingShape" mc:Ignorable="w14 w15 w16se w16cid w16 w16cex w16sdtdh w16sdtfl w16du wp14">
   <w:p>
     <w:pPr>
       <w:pStyle w:val="Header"/>
@@ -33433,7 +32594,7 @@
 </file>
 
 <file path=word/styles.xml><?xml version="1.0" encoding="utf-8"?>
-<w:styles xmlns:mc="http://schemas.openxmlformats.org/markup-compatibility/2006" xmlns:r="http://schemas.openxmlformats.org/officeDocument/2006/relationships" xmlns:w="http://schemas.openxmlformats.org/wordprocessingml/2006/main" xmlns:w14="http://schemas.microsoft.com/office/word/2010/wordml" xmlns:w15="http://schemas.microsoft.com/office/word/2012/wordml" xmlns:w16cex="http://schemas.microsoft.com/office/word/2018/wordml/cex" xmlns:w16cid="http://schemas.microsoft.com/office/word/2016/wordml/cid" xmlns:w16="http://schemas.microsoft.com/office/word/2018/wordml" xmlns:w16sdtdh="http://schemas.microsoft.com/office/word/2020/wordml/sdtdatahash" xmlns:w16se="http://schemas.microsoft.com/office/word/2015/wordml/symex" mc:Ignorable="w14 w15 w16se w16cid w16 w16cex w16sdtdh">
+<w:styles xmlns:mc="http://schemas.openxmlformats.org/markup-compatibility/2006" xmlns:r="http://schemas.openxmlformats.org/officeDocument/2006/relationships" xmlns:w="http://schemas.openxmlformats.org/wordprocessingml/2006/main" xmlns:w14="http://schemas.microsoft.com/office/word/2010/wordml" xmlns:w15="http://schemas.microsoft.com/office/word/2012/wordml" xmlns:w16cex="http://schemas.microsoft.com/office/word/2018/wordml/cex" xmlns:w16cid="http://schemas.microsoft.com/office/word/2016/wordml/cid" xmlns:w16="http://schemas.microsoft.com/office/word/2018/wordml" xmlns:w16du="http://schemas.microsoft.com/office/word/2023/wordml/word16du" xmlns:w16sdtdh="http://schemas.microsoft.com/office/word/2020/wordml/sdtdatahash" xmlns:w16sdtfl="http://schemas.microsoft.com/office/word/2024/wordml/sdtformatlock" xmlns:w16se="http://schemas.microsoft.com/office/word/2015/wordml/symex" mc:Ignorable="w14 w15 w16se w16cid w16 w16cex w16sdtdh w16sdtfl w16du">
   <w:docDefaults>
     <w:rPrDefault>
       <w:rPr>

</xml_diff>